<commit_message>
R & Bsit Tries
</commit_message>
<xml_diff>
--- a/Five/R/Lab2/МихайличТРИПО_Лаб2.docx
+++ b/Five/R/Lab2/МихайличТРИПО_Лаб2.docx
@@ -841,13 +841,7 @@
         <w:t>Изучение методов защиты, применяемых во вредоносном программном обеспечении и способов их обхода. Изучение методов анализа бинарного кода.</w:t>
       </w:r>
     </w:p>
-    <w:p>
-      <w:pPr>
-        <w:rPr>
-          <w:lang w:val="en-US"/>
-        </w:rPr>
-      </w:pPr>
-    </w:p>
+    <w:p/>
     <w:p>
       <w:pPr>
         <w:pStyle w:val="a9"/>
@@ -872,12 +866,14 @@
       <w:r>
         <w:t xml:space="preserve">и </w:t>
       </w:r>
+      <w:proofErr w:type="spellStart"/>
       <w:r>
         <w:rPr>
           <w:lang w:val="en-US"/>
         </w:rPr>
         <w:t>Ghidra</w:t>
       </w:r>
+      <w:proofErr w:type="spellEnd"/>
       <w:r>
         <w:t xml:space="preserve"> </w:t>
       </w:r>
@@ -891,6 +887,9 @@
         <w:pStyle w:val="a8"/>
       </w:pPr>
       <w:r>
+        <w:rPr>
+          <w:noProof/>
+        </w:rPr>
         <w:drawing>
           <wp:inline distT="0" distB="0" distL="0" distR="0" wp14:anchorId="36AF9E23" wp14:editId="49250099">
             <wp:extent cx="6300470" cy="996315"/>
@@ -942,13 +941,7 @@
         <w:t xml:space="preserve">При запуске отладки программа определяет наличие отладчика и завершает работу. </w:t>
       </w:r>
     </w:p>
-    <w:p>
-      <w:pPr>
-        <w:rPr>
-          <w:lang w:val="en-US"/>
-        </w:rPr>
-      </w:pPr>
-    </w:p>
+    <w:p/>
     <w:p>
       <w:pPr>
         <w:pStyle w:val="a8"/>
@@ -958,6 +951,7 @@
       </w:pPr>
       <w:r>
         <w:rPr>
+          <w:noProof/>
           <w:lang w:val="en-US"/>
         </w:rPr>
         <w:drawing>
@@ -1007,45 +1001,104 @@
     </w:p>
     <w:p/>
     <w:p>
-      <w:pPr>
-        <w:rPr>
-          <w:lang w:val="en-US"/>
-        </w:rPr>
-      </w:pPr>
-      <w:r>
-        <w:t xml:space="preserve">После этого было принято решение изучить декомпилированный код, полученный с помощью </w:t>
-      </w:r>
-      <w:r>
-        <w:rPr>
-          <w:lang w:val="en-US"/>
-        </w:rPr>
-        <w:t>Ghidra.</w:t>
-      </w:r>
-    </w:p>
-    <w:p>
-      <w:pPr>
-        <w:rPr>
-          <w:lang w:val="en-US"/>
-        </w:rPr>
-      </w:pPr>
-    </w:p>
+      <w:r>
+        <w:t xml:space="preserve">Для начала надо найти все использования инструкции </w:t>
+      </w:r>
+      <w:proofErr w:type="spellStart"/>
+      <w:r>
+        <w:rPr>
+          <w:lang w:val="en-US"/>
+        </w:rPr>
+        <w:t>xor</w:t>
+      </w:r>
+      <w:proofErr w:type="spellEnd"/>
+      <w:r>
+        <w:t xml:space="preserve">, которые потенциально могут использоваться в шифровании строк. Для этого был написан скрипт </w:t>
+      </w:r>
+      <w:proofErr w:type="spellStart"/>
+      <w:r>
+        <w:rPr>
+          <w:lang w:val="en-US"/>
+        </w:rPr>
+        <w:t>XORdetect</w:t>
+      </w:r>
+      <w:proofErr w:type="spellEnd"/>
+      <w:r>
+        <w:t>.</w:t>
+      </w:r>
+      <w:proofErr w:type="spellStart"/>
+      <w:r>
+        <w:rPr>
+          <w:lang w:val="en-US"/>
+        </w:rPr>
+        <w:t>py</w:t>
+      </w:r>
+      <w:proofErr w:type="spellEnd"/>
+      <w:r>
+        <w:t xml:space="preserve">, </w:t>
+      </w:r>
+      <w:r>
+        <w:t xml:space="preserve">который в сегменте </w:t>
+      </w:r>
+      <w:r>
+        <w:rPr>
+          <w:lang w:val="en-US"/>
+        </w:rPr>
+        <w:t>text</w:t>
+      </w:r>
+      <w:r>
+        <w:t xml:space="preserve"> </w:t>
+      </w:r>
+      <w:r>
+        <w:t xml:space="preserve">находит все использования </w:t>
+      </w:r>
+      <w:proofErr w:type="spellStart"/>
+      <w:r>
+        <w:rPr>
+          <w:lang w:val="en-US"/>
+        </w:rPr>
+        <w:t>xor</w:t>
+      </w:r>
+      <w:proofErr w:type="spellEnd"/>
+      <w:r>
+        <w:t>, исключая обнуления</w:t>
+      </w:r>
+      <w:r>
+        <w:t>.</w:t>
+      </w:r>
+    </w:p>
+    <w:p>
+      <w:r>
+        <w:t xml:space="preserve">Данный скрипт был применен в </w:t>
+      </w:r>
+      <w:r>
+        <w:rPr>
+          <w:lang w:val="en-US"/>
+        </w:rPr>
+        <w:t>IDA</w:t>
+      </w:r>
+      <w:r>
+        <w:t xml:space="preserve"> </w:t>
+      </w:r>
+      <w:r>
+        <w:t>и выдал нужную информацию.</w:t>
+      </w:r>
+    </w:p>
+    <w:p/>
     <w:p>
       <w:pPr>
         <w:pStyle w:val="a8"/>
-        <w:rPr>
-          <w:lang w:val="en-US"/>
-        </w:rPr>
-      </w:pPr>
-      <w:r>
-        <w:rPr>
-          <w:lang w:val="en-US"/>
+      </w:pPr>
+      <w:r>
+        <w:rPr>
+          <w:noProof/>
         </w:rPr>
         <w:lastRenderedPageBreak/>
         <w:drawing>
-          <wp:inline distT="0" distB="0" distL="0" distR="0" wp14:anchorId="01B14A96" wp14:editId="098717EA">
-            <wp:extent cx="5982535" cy="5572903"/>
-            <wp:effectExtent l="0" t="0" r="0" b="8890"/>
-            <wp:docPr id="1116693084" name="Picture 1"/>
+          <wp:inline distT="0" distB="0" distL="0" distR="0" wp14:anchorId="3DF7AC1F" wp14:editId="286B551B">
+            <wp:extent cx="6300470" cy="3990975"/>
+            <wp:effectExtent l="0" t="0" r="0" b="0"/>
+            <wp:docPr id="1382228557" name="Picture 1"/>
             <wp:cNvGraphicFramePr>
               <a:graphicFrameLocks xmlns:a="http://schemas.openxmlformats.org/drawingml/2006/main" noChangeAspect="1"/>
             </wp:cNvGraphicFramePr>
@@ -1053,7 +1106,7 @@
               <a:graphicData uri="http://schemas.openxmlformats.org/drawingml/2006/picture">
                 <pic:pic xmlns:pic="http://schemas.openxmlformats.org/drawingml/2006/picture">
                   <pic:nvPicPr>
-                    <pic:cNvPr id="1116693084" name=""/>
+                    <pic:cNvPr id="1382228557" name=""/>
                     <pic:cNvPicPr/>
                   </pic:nvPicPr>
                   <pic:blipFill>
@@ -1065,7 +1118,7 @@
                   <pic:spPr>
                     <a:xfrm>
                       <a:off x="0" y="0"/>
-                      <a:ext cx="5982535" cy="5572903"/>
+                      <a:ext cx="6300470" cy="3990975"/>
                     </a:xfrm>
                     <a:prstGeom prst="rect">
                       <a:avLst/>
@@ -1083,119 +1136,62 @@
         <w:pStyle w:val="a"/>
       </w:pPr>
       <w:r>
-        <w:t>Декомпилированное начало программы</w:t>
+        <w:t xml:space="preserve">Найденные использования </w:t>
+      </w:r>
+      <w:proofErr w:type="spellStart"/>
+      <w:r>
+        <w:rPr>
+          <w:lang w:val="en-US"/>
+        </w:rPr>
+        <w:t>xor</w:t>
+      </w:r>
+      <w:proofErr w:type="spellEnd"/>
+    </w:p>
+    <w:p>
+      <w:r>
+        <w:t xml:space="preserve">Далее был разработан скрипт </w:t>
+      </w:r>
+      <w:proofErr w:type="spellStart"/>
+      <w:r>
+        <w:rPr>
+          <w:lang w:val="en-US"/>
+        </w:rPr>
+        <w:t>XORdecrypt</w:t>
+      </w:r>
+      <w:proofErr w:type="spellEnd"/>
+      <w:r>
+        <w:t>.</w:t>
+      </w:r>
+      <w:proofErr w:type="spellStart"/>
+      <w:r>
+        <w:rPr>
+          <w:lang w:val="en-US"/>
+        </w:rPr>
+        <w:t>py</w:t>
+      </w:r>
+      <w:proofErr w:type="spellEnd"/>
+      <w:r>
+        <w:t xml:space="preserve">, </w:t>
+      </w:r>
+      <w:r>
+        <w:t>который перебирает возможные ключи для дешифрования строк и пишет результаты дешифровки.</w:t>
       </w:r>
     </w:p>
     <w:p/>
     <w:p>
-      <w:r>
-        <w:t xml:space="preserve">При анализе данного кода можно понять, что </w:t>
-      </w:r>
-      <w:r>
-        <w:rPr>
-          <w:lang w:val="en-US"/>
-        </w:rPr>
-        <w:t>do</w:t>
-      </w:r>
-      <w:r>
-        <w:t>-</w:t>
-      </w:r>
-      <w:r>
-        <w:rPr>
-          <w:lang w:val="en-US"/>
-        </w:rPr>
-        <w:t>while</w:t>
-      </w:r>
-      <w:r>
-        <w:t xml:space="preserve"> </w:t>
-      </w:r>
-      <w:r>
-        <w:t>цикл</w:t>
-      </w:r>
-      <w:r>
-        <w:t xml:space="preserve">ы определяют длину строки на разных этапах шифрования. Сам процесс шифрования вероятно описан в функции </w:t>
-      </w:r>
-      <w:r>
-        <w:rPr>
-          <w:lang w:val="en-US"/>
-        </w:rPr>
-        <w:t>FUN</w:t>
-      </w:r>
-      <w:r>
-        <w:t>_004014</w:t>
-      </w:r>
-      <w:r>
-        <w:rPr>
-          <w:lang w:val="en-US"/>
-        </w:rPr>
-        <w:t>a</w:t>
-      </w:r>
-      <w:r>
-        <w:t>0()</w:t>
-      </w:r>
-      <w:r>
-        <w:t xml:space="preserve">. Сама функция принимает саму строку и ее длину, так как </w:t>
-      </w:r>
-      <w:r>
-        <w:rPr>
-          <w:lang w:val="en-US"/>
-        </w:rPr>
-        <w:t>do</w:t>
-      </w:r>
-      <w:r>
-        <w:t>-</w:t>
-      </w:r>
-      <w:r>
-        <w:rPr>
-          <w:lang w:val="en-US"/>
-        </w:rPr>
-        <w:t>while</w:t>
-      </w:r>
-      <w:r>
-        <w:t xml:space="preserve"> </w:t>
-      </w:r>
-      <w:r>
-        <w:t xml:space="preserve">цикл искал длину строки через разницу адресов начала и конца строки. При просмотре этой функции можно убедиться что это шифрование через </w:t>
-      </w:r>
-      <w:r>
-        <w:rPr>
-          <w:lang w:val="en-US"/>
-        </w:rPr>
-        <w:t>xor</w:t>
-      </w:r>
-      <w:r>
-        <w:t xml:space="preserve"> </w:t>
-      </w:r>
-      <w:r>
-        <w:t xml:space="preserve">с </w:t>
-      </w:r>
-      <w:r>
-        <w:t>0</w:t>
-      </w:r>
-      <w:r>
-        <w:rPr>
-          <w:lang w:val="en-US"/>
-        </w:rPr>
-        <w:t>x</w:t>
-      </w:r>
-      <w:r>
-        <w:t xml:space="preserve">22 </w:t>
-      </w:r>
-      <w:r>
-        <w:t>всех символов строки.</w:t>
-      </w:r>
-    </w:p>
-    <w:p>
       <w:pPr>
         <w:pStyle w:val="a8"/>
       </w:pPr>
       <w:r>
+        <w:rPr>
+          <w:noProof/>
+        </w:rPr>
         <w:lastRenderedPageBreak/>
         <w:drawing>
-          <wp:inline distT="0" distB="0" distL="0" distR="0" wp14:anchorId="6E32487B" wp14:editId="1A137E03">
-            <wp:extent cx="5449060" cy="2067213"/>
-            <wp:effectExtent l="0" t="0" r="0" b="9525"/>
-            <wp:docPr id="384389483" name="Picture 1"/>
+          <wp:inline distT="0" distB="0" distL="0" distR="0" wp14:anchorId="13D9A28C" wp14:editId="18F8BC5C">
+            <wp:extent cx="6300470" cy="3910965"/>
+            <wp:effectExtent l="0" t="0" r="0" b="0"/>
+            <wp:docPr id="1735289413" name="Picture 1"/>
             <wp:cNvGraphicFramePr>
               <a:graphicFrameLocks xmlns:a="http://schemas.openxmlformats.org/drawingml/2006/main" noChangeAspect="1"/>
             </wp:cNvGraphicFramePr>
@@ -1203,7 +1199,7 @@
               <a:graphicData uri="http://schemas.openxmlformats.org/drawingml/2006/picture">
                 <pic:pic xmlns:pic="http://schemas.openxmlformats.org/drawingml/2006/picture">
                   <pic:nvPicPr>
-                    <pic:cNvPr id="384389483" name=""/>
+                    <pic:cNvPr id="1735289413" name=""/>
                     <pic:cNvPicPr/>
                   </pic:nvPicPr>
                   <pic:blipFill>
@@ -1215,7 +1211,7 @@
                   <pic:spPr>
                     <a:xfrm>
                       <a:off x="0" y="0"/>
-                      <a:ext cx="5449060" cy="2067213"/>
+                      <a:ext cx="6300470" cy="3910965"/>
                     </a:xfrm>
                     <a:prstGeom prst="rect">
                       <a:avLst/>
@@ -1231,49 +1227,154 @@
     <w:p>
       <w:pPr>
         <w:pStyle w:val="a"/>
-      </w:pPr>
-      <w:r>
-        <w:t>Декомпилированная функция шифрования.</w:t>
+        <w:rPr>
+          <w:lang w:val="en-US"/>
+        </w:rPr>
+      </w:pPr>
+      <w:r>
+        <w:t xml:space="preserve">Результат работы </w:t>
+      </w:r>
+      <w:r>
+        <w:rPr>
+          <w:lang w:val="en-US"/>
+        </w:rPr>
+        <w:t>XORdecrypt.py</w:t>
+      </w:r>
+    </w:p>
+    <w:p>
+      <w:pPr>
+        <w:rPr>
+          <w:lang w:val="en-US"/>
+        </w:rPr>
+      </w:pPr>
+    </w:p>
+    <w:p>
+      <w:r>
+        <w:t xml:space="preserve">Также был реализован скрипт </w:t>
+      </w:r>
+      <w:proofErr w:type="spellStart"/>
+      <w:r>
+        <w:rPr>
+          <w:lang w:val="en-US"/>
+        </w:rPr>
+        <w:t>PEBdetect</w:t>
+      </w:r>
+      <w:proofErr w:type="spellEnd"/>
+      <w:r>
+        <w:t>.</w:t>
+      </w:r>
+      <w:proofErr w:type="spellStart"/>
+      <w:r>
+        <w:rPr>
+          <w:lang w:val="en-US"/>
+        </w:rPr>
+        <w:t>py</w:t>
+      </w:r>
+      <w:proofErr w:type="spellEnd"/>
+      <w:r>
+        <w:t xml:space="preserve">, находящий все обращения к </w:t>
+      </w:r>
+      <w:r>
+        <w:rPr>
+          <w:lang w:val="en-US"/>
+        </w:rPr>
+        <w:t>Process</w:t>
+      </w:r>
+      <w:r>
+        <w:t xml:space="preserve"> </w:t>
+      </w:r>
+      <w:proofErr w:type="spellStart"/>
+      <w:r>
+        <w:rPr>
+          <w:lang w:val="en-US"/>
+        </w:rPr>
+        <w:t>Enviroment</w:t>
+      </w:r>
+      <w:proofErr w:type="spellEnd"/>
+      <w:r>
+        <w:t xml:space="preserve"> </w:t>
+      </w:r>
+      <w:r>
+        <w:rPr>
+          <w:lang w:val="en-US"/>
+        </w:rPr>
+        <w:t>Block</w:t>
+      </w:r>
+      <w:r>
+        <w:t xml:space="preserve">, </w:t>
+      </w:r>
+      <w:r>
+        <w:t xml:space="preserve">а конкретно к регистрам </w:t>
+      </w:r>
+      <w:r>
+        <w:rPr>
+          <w:lang w:val="en-US"/>
+        </w:rPr>
+        <w:t>fs</w:t>
+      </w:r>
+      <w:r>
+        <w:t xml:space="preserve"> </w:t>
+      </w:r>
+      <w:r>
+        <w:t xml:space="preserve">и </w:t>
+      </w:r>
+      <w:r>
+        <w:rPr>
+          <w:lang w:val="en-US"/>
+        </w:rPr>
+        <w:t>gs</w:t>
+      </w:r>
+      <w:r>
+        <w:t xml:space="preserve"> </w:t>
+      </w:r>
+      <w:r>
+        <w:t xml:space="preserve">со стандартными смещениями </w:t>
+      </w:r>
+      <w:r>
+        <w:t>30</w:t>
+      </w:r>
+      <w:r>
+        <w:rPr>
+          <w:lang w:val="en-US"/>
+        </w:rPr>
+        <w:t>h</w:t>
+      </w:r>
+      <w:r>
+        <w:t xml:space="preserve"> </w:t>
+      </w:r>
+      <w:r>
+        <w:t xml:space="preserve">и </w:t>
+      </w:r>
+      <w:r>
+        <w:t>60</w:t>
+      </w:r>
+      <w:r>
+        <w:rPr>
+          <w:lang w:val="en-US"/>
+        </w:rPr>
+        <w:t>h</w:t>
+      </w:r>
+      <w:r>
+        <w:t xml:space="preserve"> </w:t>
+      </w:r>
+      <w:r>
+        <w:t>соответственно.</w:t>
       </w:r>
     </w:p>
     <w:p/>
     <w:p>
-      <w:r>
-        <w:t xml:space="preserve">Далее была проанализированна функция </w:t>
-      </w:r>
-      <w:r>
-        <w:rPr>
-          <w:lang w:val="en-US"/>
-        </w:rPr>
-        <w:t>FUN</w:t>
-      </w:r>
-      <w:r>
-        <w:t>_00401300()</w:t>
-      </w:r>
-      <w:r>
-        <w:t xml:space="preserve">, которая оказалось проверкой на действительность адреса </w:t>
-      </w:r>
-      <w:r>
-        <w:rPr>
-          <w:lang w:val="en-US"/>
-        </w:rPr>
-        <w:t>heap</w:t>
-      </w:r>
-      <w:r>
-        <w:t>.</w:t>
-      </w:r>
-    </w:p>
-    <w:p/>
-    <w:p>
       <w:pPr>
         <w:pStyle w:val="a8"/>
       </w:pPr>
       <w:r>
+        <w:rPr>
+          <w:noProof/>
+        </w:rPr>
         <w:drawing>
-          <wp:inline distT="0" distB="0" distL="0" distR="0" wp14:anchorId="658E5A55" wp14:editId="212C60D9">
-            <wp:extent cx="4220164" cy="1667108"/>
-            <wp:effectExtent l="0" t="0" r="0" b="9525"/>
-            <wp:docPr id="295703995" name="Picture 1"/>
+          <wp:inline distT="0" distB="0" distL="0" distR="0" wp14:anchorId="24CD032C" wp14:editId="67FF7963">
+            <wp:extent cx="4086795" cy="1105054"/>
+            <wp:effectExtent l="0" t="0" r="9525" b="0"/>
+            <wp:docPr id="1421212246" name="Picture 1"/>
             <wp:cNvGraphicFramePr>
               <a:graphicFrameLocks xmlns:a="http://schemas.openxmlformats.org/drawingml/2006/main" noChangeAspect="1"/>
             </wp:cNvGraphicFramePr>
@@ -1281,7 +1382,7 @@
               <a:graphicData uri="http://schemas.openxmlformats.org/drawingml/2006/picture">
                 <pic:pic xmlns:pic="http://schemas.openxmlformats.org/drawingml/2006/picture">
                   <pic:nvPicPr>
-                    <pic:cNvPr id="295703995" name=""/>
+                    <pic:cNvPr id="1421212246" name=""/>
                     <pic:cNvPicPr/>
                   </pic:nvPicPr>
                   <pic:blipFill>
@@ -1293,7 +1394,7 @@
                   <pic:spPr>
                     <a:xfrm>
                       <a:off x="0" y="0"/>
-                      <a:ext cx="4220164" cy="1667108"/>
+                      <a:ext cx="4086795" cy="1105054"/>
                     </a:xfrm>
                     <a:prstGeom prst="rect">
                       <a:avLst/>
@@ -1309,52 +1410,91 @@
     <w:p>
       <w:pPr>
         <w:pStyle w:val="a"/>
-      </w:pPr>
-      <w:r>
-        <w:t>Проверка действительности адреса кучи.</w:t>
+        <w:rPr>
+          <w:lang w:val="en-US"/>
+        </w:rPr>
+      </w:pPr>
+      <w:r>
+        <w:t xml:space="preserve">Результат работы </w:t>
+      </w:r>
+      <w:r>
+        <w:rPr>
+          <w:lang w:val="en-US"/>
+        </w:rPr>
+        <w:t>PEBdetect.py</w:t>
+      </w:r>
+    </w:p>
+    <w:p>
+      <w:pPr>
+        <w:rPr>
+          <w:lang w:val="en-US"/>
+        </w:rPr>
+      </w:pPr>
+    </w:p>
+    <w:p>
+      <w:r>
+        <w:t xml:space="preserve">Для поиска участков кода, где замеряется время используется скрипт </w:t>
+      </w:r>
+      <w:r>
+        <w:rPr>
+          <w:lang w:val="en-US"/>
+        </w:rPr>
+        <w:t>TIMEAPIdetect</w:t>
+      </w:r>
+      <w:r>
+        <w:t>.</w:t>
+      </w:r>
+      <w:proofErr w:type="spellStart"/>
+      <w:r>
+        <w:rPr>
+          <w:lang w:val="en-US"/>
+        </w:rPr>
+        <w:t>py</w:t>
+      </w:r>
+      <w:proofErr w:type="spellEnd"/>
+      <w:r>
+        <w:t xml:space="preserve">, </w:t>
+      </w:r>
+      <w:r>
+        <w:t xml:space="preserve">который ищет в мнемониках инструкций </w:t>
+      </w:r>
+      <w:r>
+        <w:t>rdtsc</w:t>
+      </w:r>
+      <w:r>
+        <w:t xml:space="preserve">. Также скрипт ищет вызовы функций для замера времени, такие как </w:t>
+      </w:r>
+      <w:proofErr w:type="spellStart"/>
+      <w:r>
+        <w:rPr>
+          <w:lang w:val="en-US"/>
+        </w:rPr>
+        <w:t>GetTickCount</w:t>
+      </w:r>
+      <w:proofErr w:type="spellEnd"/>
+      <w:r>
+        <w:t>.</w:t>
       </w:r>
     </w:p>
     <w:p/>
     <w:p>
-      <w:r>
-        <w:t xml:space="preserve">Функция </w:t>
-      </w:r>
-      <w:r>
-        <w:rPr>
-          <w:lang w:val="en-US"/>
-        </w:rPr>
-        <w:t>FUN</w:t>
-      </w:r>
-      <w:r>
-        <w:t>_004012</w:t>
-      </w:r>
-      <w:r>
-        <w:rPr>
-          <w:lang w:val="en-US"/>
-        </w:rPr>
-        <w:t>d</w:t>
-      </w:r>
-      <w:r>
-        <w:t xml:space="preserve">0() </w:t>
-      </w:r>
-      <w:r>
-        <w:t xml:space="preserve">просто возвращает адрес </w:t>
-      </w:r>
-      <w:r>
-        <w:t>кучи.</w:t>
-      </w:r>
-    </w:p>
-    <w:p/>
-    <w:p>
       <w:pPr>
         <w:pStyle w:val="a8"/>
-      </w:pPr>
-      <w:r>
+        <w:rPr>
+          <w:lang w:val="en-US"/>
+        </w:rPr>
+      </w:pPr>
+      <w:r>
+        <w:rPr>
+          <w:noProof/>
+          <w:lang w:val="en-US"/>
+        </w:rPr>
+        <w:lastRenderedPageBreak/>
         <w:drawing>
-          <wp:inline distT="0" distB="0" distL="0" distR="0" wp14:anchorId="6DCE1CAE" wp14:editId="172F3C6B">
-            <wp:extent cx="4810796" cy="1505160"/>
-            <wp:effectExtent l="0" t="0" r="8890" b="0"/>
-            <wp:docPr id="1728235414" name="Picture 1"/>
+          <wp:inline distT="0" distB="0" distL="0" distR="0" wp14:anchorId="7751F49E" wp14:editId="1E2258CC">
+            <wp:extent cx="4220164" cy="657317"/>
+            <wp:effectExtent l="0" t="0" r="0" b="9525"/>
+            <wp:docPr id="635426889" name="Picture 1"/>
             <wp:cNvGraphicFramePr>
               <a:graphicFrameLocks xmlns:a="http://schemas.openxmlformats.org/drawingml/2006/main" noChangeAspect="1"/>
             </wp:cNvGraphicFramePr>
@@ -1362,7 +1502,7 @@
               <a:graphicData uri="http://schemas.openxmlformats.org/drawingml/2006/picture">
                 <pic:pic xmlns:pic="http://schemas.openxmlformats.org/drawingml/2006/picture">
                   <pic:nvPicPr>
-                    <pic:cNvPr id="1728235414" name=""/>
+                    <pic:cNvPr id="635426889" name=""/>
                     <pic:cNvPicPr/>
                   </pic:nvPicPr>
                   <pic:blipFill>
@@ -1374,7 +1514,7 @@
                   <pic:spPr>
                     <a:xfrm>
                       <a:off x="0" y="0"/>
-                      <a:ext cx="4810796" cy="1505160"/>
+                      <a:ext cx="4220164" cy="657317"/>
                     </a:xfrm>
                     <a:prstGeom prst="rect">
                       <a:avLst/>
@@ -1392,22 +1532,2184 @@
         <w:pStyle w:val="a"/>
       </w:pPr>
       <w:r>
-        <w:t>Получение адреса кучи.</w:t>
+        <w:t xml:space="preserve">Результат работы </w:t>
+      </w:r>
+      <w:r>
+        <w:rPr>
+          <w:lang w:val="en-US"/>
+        </w:rPr>
+        <w:t>TIMEAPIdetect.py</w:t>
       </w:r>
     </w:p>
     <w:p/>
     <w:p>
       <w:r>
-        <w:t>д</w:t>
-      </w:r>
-    </w:p>
+        <w:t xml:space="preserve">Для поиска редких инструкций скрипт </w:t>
+      </w:r>
+      <w:proofErr w:type="spellStart"/>
+      <w:r>
+        <w:rPr>
+          <w:lang w:val="en-US"/>
+        </w:rPr>
+        <w:t>EXOTICdetect</w:t>
+      </w:r>
+      <w:proofErr w:type="spellEnd"/>
+      <w:r>
+        <w:t>.</w:t>
+      </w:r>
+      <w:proofErr w:type="spellStart"/>
+      <w:r>
+        <w:rPr>
+          <w:lang w:val="en-US"/>
+        </w:rPr>
+        <w:t>py</w:t>
+      </w:r>
+      <w:proofErr w:type="spellEnd"/>
+      <w:r>
+        <w:t xml:space="preserve"> </w:t>
+      </w:r>
+      <w:r>
+        <w:t xml:space="preserve">сканирует сегмент кода на наличие инструкций в сигнатурном списке, также учтена более строкая проверка </w:t>
+      </w:r>
+      <w:r>
+        <w:rPr>
+          <w:lang w:val="en-US"/>
+        </w:rPr>
+        <w:t>int</w:t>
+      </w:r>
+      <w:r>
+        <w:t xml:space="preserve"> </w:t>
+      </w:r>
+      <w:r>
+        <w:t xml:space="preserve">на наличие именно операнда </w:t>
+      </w:r>
+      <w:r>
+        <w:t>2</w:t>
+      </w:r>
+      <w:r>
+        <w:rPr>
+          <w:lang w:val="en-US"/>
+        </w:rPr>
+        <w:t>d</w:t>
+      </w:r>
+      <w:r>
+        <w:t>.</w:t>
+      </w:r>
+    </w:p>
+    <w:p/>
+    <w:p>
+      <w:pPr>
+        <w:pStyle w:val="a8"/>
+      </w:pPr>
+      <w:r>
+        <w:rPr>
+          <w:noProof/>
+        </w:rPr>
+        <w:drawing>
+          <wp:inline distT="0" distB="0" distL="0" distR="0" wp14:anchorId="0634343A" wp14:editId="1BC45B95">
+            <wp:extent cx="2600688" cy="1038370"/>
+            <wp:effectExtent l="0" t="0" r="9525" b="9525"/>
+            <wp:docPr id="727426442" name="Picture 1"/>
+            <wp:cNvGraphicFramePr>
+              <a:graphicFrameLocks xmlns:a="http://schemas.openxmlformats.org/drawingml/2006/main" noChangeAspect="1"/>
+            </wp:cNvGraphicFramePr>
+            <a:graphic xmlns:a="http://schemas.openxmlformats.org/drawingml/2006/main">
+              <a:graphicData uri="http://schemas.openxmlformats.org/drawingml/2006/picture">
+                <pic:pic xmlns:pic="http://schemas.openxmlformats.org/drawingml/2006/picture">
+                  <pic:nvPicPr>
+                    <pic:cNvPr id="727426442" name=""/>
+                    <pic:cNvPicPr/>
+                  </pic:nvPicPr>
+                  <pic:blipFill>
+                    <a:blip r:embed="rId14"/>
+                    <a:stretch>
+                      <a:fillRect/>
+                    </a:stretch>
+                  </pic:blipFill>
+                  <pic:spPr>
+                    <a:xfrm>
+                      <a:off x="0" y="0"/>
+                      <a:ext cx="2600688" cy="1038370"/>
+                    </a:xfrm>
+                    <a:prstGeom prst="rect">
+                      <a:avLst/>
+                    </a:prstGeom>
+                  </pic:spPr>
+                </pic:pic>
+              </a:graphicData>
+            </a:graphic>
+          </wp:inline>
+        </w:drawing>
+      </w:r>
+    </w:p>
+    <w:p>
+      <w:pPr>
+        <w:pStyle w:val="a"/>
+        <w:rPr>
+          <w:lang w:val="en-US"/>
+        </w:rPr>
+      </w:pPr>
+      <w:r>
+        <w:t xml:space="preserve">Резульат работы </w:t>
+      </w:r>
+      <w:r>
+        <w:rPr>
+          <w:lang w:val="en-US"/>
+        </w:rPr>
+        <w:t>EXOTICdetect.py</w:t>
+      </w:r>
+    </w:p>
+    <w:p>
+      <w:pPr>
+        <w:rPr>
+          <w:lang w:val="en-US"/>
+        </w:rPr>
+      </w:pPr>
+    </w:p>
+    <w:p>
+      <w:r>
+        <w:t xml:space="preserve">Также были разработанны скрипты, обнаруживающие сигнатуры антиотладочных проверок, например </w:t>
+      </w:r>
+      <w:proofErr w:type="spellStart"/>
+      <w:r>
+        <w:rPr>
+          <w:lang w:val="en-US"/>
+        </w:rPr>
+        <w:t>IsDebuggerPresent</w:t>
+      </w:r>
+      <w:proofErr w:type="spellEnd"/>
+      <w:r>
+        <w:t>; методы защиты стека (</w:t>
+      </w:r>
+      <w:r>
+        <w:t>_</w:t>
+      </w:r>
+      <w:r>
+        <w:rPr>
+          <w:lang w:val="en-US"/>
+        </w:rPr>
+        <w:t>security</w:t>
+      </w:r>
+      <w:r>
+        <w:t>_</w:t>
+      </w:r>
+      <w:r>
+        <w:rPr>
+          <w:lang w:val="en-US"/>
+        </w:rPr>
+        <w:t>cookie</w:t>
+      </w:r>
+      <w:r>
+        <w:t>)</w:t>
+      </w:r>
+      <w:r>
+        <w:t xml:space="preserve"> и </w:t>
+      </w:r>
+      <w:r>
+        <w:rPr>
+          <w:lang w:val="en-US"/>
+        </w:rPr>
+        <w:t>TLS</w:t>
+      </w:r>
+      <w:r>
+        <w:t xml:space="preserve">-секции, которые используются для инициализации антиотладочных проверок перед переходом в </w:t>
+      </w:r>
+      <w:r>
+        <w:rPr>
+          <w:lang w:val="en-US"/>
+        </w:rPr>
+        <w:t>main</w:t>
+      </w:r>
+      <w:r>
+        <w:t>()</w:t>
+      </w:r>
+      <w:r>
+        <w:t>.</w:t>
+      </w:r>
+    </w:p>
+    <w:p/>
+    <w:p>
+      <w:pPr>
+        <w:pStyle w:val="a8"/>
+      </w:pPr>
+      <w:r>
+        <w:rPr>
+          <w:noProof/>
+        </w:rPr>
+        <w:drawing>
+          <wp:inline distT="0" distB="0" distL="0" distR="0" wp14:anchorId="5C3CF986" wp14:editId="640FBC58">
+            <wp:extent cx="6300470" cy="975995"/>
+            <wp:effectExtent l="0" t="0" r="0" b="0"/>
+            <wp:docPr id="1559457448" name="Picture 1"/>
+            <wp:cNvGraphicFramePr>
+              <a:graphicFrameLocks xmlns:a="http://schemas.openxmlformats.org/drawingml/2006/main" noChangeAspect="1"/>
+            </wp:cNvGraphicFramePr>
+            <a:graphic xmlns:a="http://schemas.openxmlformats.org/drawingml/2006/main">
+              <a:graphicData uri="http://schemas.openxmlformats.org/drawingml/2006/picture">
+                <pic:pic xmlns:pic="http://schemas.openxmlformats.org/drawingml/2006/picture">
+                  <pic:nvPicPr>
+                    <pic:cNvPr id="1559457448" name=""/>
+                    <pic:cNvPicPr/>
+                  </pic:nvPicPr>
+                  <pic:blipFill>
+                    <a:blip r:embed="rId15"/>
+                    <a:stretch>
+                      <a:fillRect/>
+                    </a:stretch>
+                  </pic:blipFill>
+                  <pic:spPr>
+                    <a:xfrm>
+                      <a:off x="0" y="0"/>
+                      <a:ext cx="6300470" cy="975995"/>
+                    </a:xfrm>
+                    <a:prstGeom prst="rect">
+                      <a:avLst/>
+                    </a:prstGeom>
+                  </pic:spPr>
+                </pic:pic>
+              </a:graphicData>
+            </a:graphic>
+          </wp:inline>
+        </w:drawing>
+      </w:r>
+    </w:p>
+    <w:p>
+      <w:pPr>
+        <w:pStyle w:val="a"/>
+      </w:pPr>
+      <w:r>
+        <w:t>Обнаружение других методов защиты</w:t>
+      </w:r>
+    </w:p>
+    <w:p/>
+    <w:p>
+      <w:r>
+        <w:t xml:space="preserve">Для удобства полного сканирования был создан основной скрипт, который вызывает все ранее созданные функции и последовательно исполняет их за 1 запрос. Данный централизованный скрипт был запущен на втором файле </w:t>
+      </w:r>
+      <w:r>
+        <w:t>.</w:t>
+      </w:r>
+      <w:r>
+        <w:rPr>
+          <w:lang w:val="en-US"/>
+        </w:rPr>
+        <w:t>e</w:t>
+      </w:r>
+      <w:r>
+        <w:t>_</w:t>
+      </w:r>
+      <w:proofErr w:type="spellStart"/>
+      <w:r>
+        <w:rPr>
+          <w:lang w:val="en-US"/>
+        </w:rPr>
+        <w:t>xe</w:t>
+      </w:r>
+      <w:proofErr w:type="spellEnd"/>
+      <w:r>
+        <w:t>.</w:t>
+      </w:r>
+    </w:p>
+    <w:p/>
+    <w:p>
+      <w:pPr>
+        <w:pStyle w:val="a8"/>
+        <w:rPr>
+          <w:lang w:val="en-US"/>
+        </w:rPr>
+      </w:pPr>
+      <w:r>
+        <w:rPr>
+          <w:noProof/>
+        </w:rPr>
+        <w:lastRenderedPageBreak/>
+        <w:drawing>
+          <wp:inline distT="0" distB="0" distL="0" distR="0" wp14:anchorId="027886D6" wp14:editId="2A26C4D3">
+            <wp:extent cx="6300470" cy="4310380"/>
+            <wp:effectExtent l="0" t="0" r="0" b="0"/>
+            <wp:docPr id="1010105038" name="Picture 1"/>
+            <wp:cNvGraphicFramePr>
+              <a:graphicFrameLocks xmlns:a="http://schemas.openxmlformats.org/drawingml/2006/main" noChangeAspect="1"/>
+            </wp:cNvGraphicFramePr>
+            <a:graphic xmlns:a="http://schemas.openxmlformats.org/drawingml/2006/main">
+              <a:graphicData uri="http://schemas.openxmlformats.org/drawingml/2006/picture">
+                <pic:pic xmlns:pic="http://schemas.openxmlformats.org/drawingml/2006/picture">
+                  <pic:nvPicPr>
+                    <pic:cNvPr id="1010105038" name=""/>
+                    <pic:cNvPicPr/>
+                  </pic:nvPicPr>
+                  <pic:blipFill>
+                    <a:blip r:embed="rId16"/>
+                    <a:stretch>
+                      <a:fillRect/>
+                    </a:stretch>
+                  </pic:blipFill>
+                  <pic:spPr>
+                    <a:xfrm>
+                      <a:off x="0" y="0"/>
+                      <a:ext cx="6300470" cy="4310380"/>
+                    </a:xfrm>
+                    <a:prstGeom prst="rect">
+                      <a:avLst/>
+                    </a:prstGeom>
+                  </pic:spPr>
+                </pic:pic>
+              </a:graphicData>
+            </a:graphic>
+          </wp:inline>
+        </w:drawing>
+      </w:r>
+    </w:p>
+    <w:p>
+      <w:pPr>
+        <w:pStyle w:val="a"/>
+      </w:pPr>
+      <w:r>
+        <w:t>Обнаруженные средства защиты во 2-м файле</w:t>
+      </w:r>
+    </w:p>
+    <w:p/>
+    <w:p>
+      <w:r>
+        <w:rPr>
+          <w:b/>
+          <w:bCs/>
+        </w:rPr>
+        <w:t>Пошаговый анализ механизмов антиотладки</w:t>
+      </w:r>
+    </w:p>
+    <w:p>
+      <w:r>
+        <w:t xml:space="preserve">После сбора информации с помощью </w:t>
+      </w:r>
+      <w:proofErr w:type="spellStart"/>
+      <w:r>
+        <w:rPr>
+          <w:lang w:val="en-US"/>
+        </w:rPr>
+        <w:t>IDAPython</w:t>
+      </w:r>
+      <w:proofErr w:type="spellEnd"/>
+      <w:r>
+        <w:t xml:space="preserve"> </w:t>
+      </w:r>
+      <w:r>
+        <w:t xml:space="preserve">скриптов, были изучены логи </w:t>
+      </w:r>
+      <w:r>
+        <w:rPr>
+          <w:lang w:val="en-US"/>
+        </w:rPr>
+        <w:t>IDA</w:t>
+      </w:r>
+      <w:r>
+        <w:t xml:space="preserve"> </w:t>
+      </w:r>
+      <w:r>
+        <w:t xml:space="preserve">при отладке программы. В начале отладки можно заметить вызов исключение переполнения </w:t>
+      </w:r>
+      <w:r>
+        <w:rPr>
+          <w:lang w:val="en-US"/>
+        </w:rPr>
+        <w:t>int</w:t>
+      </w:r>
+      <w:r>
+        <w:t>.</w:t>
+      </w:r>
+    </w:p>
+    <w:p>
+      <w:pPr>
+        <w:pStyle w:val="a8"/>
+      </w:pPr>
+      <w:r>
+        <w:lastRenderedPageBreak/>
+        <w:drawing>
+          <wp:inline distT="0" distB="0" distL="0" distR="0" wp14:anchorId="0820EF40" wp14:editId="23F15E88">
+            <wp:extent cx="6300470" cy="4448175"/>
+            <wp:effectExtent l="0" t="0" r="0" b="0"/>
+            <wp:docPr id="1700761691" name="Picture 1"/>
+            <wp:cNvGraphicFramePr>
+              <a:graphicFrameLocks xmlns:a="http://schemas.openxmlformats.org/drawingml/2006/main" noChangeAspect="1"/>
+            </wp:cNvGraphicFramePr>
+            <a:graphic xmlns:a="http://schemas.openxmlformats.org/drawingml/2006/main">
+              <a:graphicData uri="http://schemas.openxmlformats.org/drawingml/2006/picture">
+                <pic:pic xmlns:pic="http://schemas.openxmlformats.org/drawingml/2006/picture">
+                  <pic:nvPicPr>
+                    <pic:cNvPr id="1700761691" name=""/>
+                    <pic:cNvPicPr/>
+                  </pic:nvPicPr>
+                  <pic:blipFill>
+                    <a:blip r:embed="rId17"/>
+                    <a:stretch>
+                      <a:fillRect/>
+                    </a:stretch>
+                  </pic:blipFill>
+                  <pic:spPr>
+                    <a:xfrm>
+                      <a:off x="0" y="0"/>
+                      <a:ext cx="6300470" cy="4448175"/>
+                    </a:xfrm>
+                    <a:prstGeom prst="rect">
+                      <a:avLst/>
+                    </a:prstGeom>
+                  </pic:spPr>
+                </pic:pic>
+              </a:graphicData>
+            </a:graphic>
+          </wp:inline>
+        </w:drawing>
+      </w:r>
+    </w:p>
+    <w:p>
+      <w:pPr>
+        <w:pStyle w:val="a"/>
+      </w:pPr>
+      <w:r>
+        <w:t xml:space="preserve">Вывод </w:t>
+      </w:r>
+      <w:r>
+        <w:rPr>
+          <w:lang w:val="en-US"/>
+        </w:rPr>
+        <w:t>IDA</w:t>
+      </w:r>
+      <w:r>
+        <w:t xml:space="preserve"> </w:t>
+      </w:r>
+      <w:r>
+        <w:t>при отладке программы.</w:t>
+      </w:r>
+    </w:p>
+    <w:p/>
+    <w:p/>
+    <w:p/>
+    <w:p>
+      <w:r>
+        <w:t xml:space="preserve"> </w:t>
+      </w:r>
+      <w:r>
+        <w:t xml:space="preserve">При анализе было опеределено, что это вызвано исключение вида </w:t>
+      </w:r>
+      <w:proofErr w:type="spellStart"/>
+      <w:r>
+        <w:rPr>
+          <w:lang w:val="en-US"/>
+        </w:rPr>
+        <w:t>ZeroDevisionError</w:t>
+      </w:r>
+      <w:proofErr w:type="spellEnd"/>
+      <w:r>
+        <w:t xml:space="preserve">, </w:t>
+      </w:r>
+      <w:r>
+        <w:t xml:space="preserve">которое используется с инструкцией </w:t>
+      </w:r>
+      <w:proofErr w:type="spellStart"/>
+      <w:r>
+        <w:rPr>
+          <w:lang w:val="en-US"/>
+        </w:rPr>
+        <w:t>rdtsc</w:t>
+      </w:r>
+      <w:proofErr w:type="spellEnd"/>
+      <w:r>
+        <w:t xml:space="preserve">, измеряющей количество тактов процессора до и после вызова исключения. Если разница больше </w:t>
+      </w:r>
+      <w:r>
+        <w:t>150000h</w:t>
+      </w:r>
+      <w:r>
+        <w:t>, то вызывается деление на ноль.</w:t>
+      </w:r>
+    </w:p>
+    <w:p/>
+    <w:p>
+      <w:pPr>
+        <w:pStyle w:val="a8"/>
+      </w:pPr>
+      <w:r>
+        <w:lastRenderedPageBreak/>
+        <w:drawing>
+          <wp:inline distT="0" distB="0" distL="0" distR="0" wp14:anchorId="085032A0" wp14:editId="07B2CBEA">
+            <wp:extent cx="4648849" cy="3296110"/>
+            <wp:effectExtent l="0" t="0" r="0" b="0"/>
+            <wp:docPr id="903310017" name="Picture 1"/>
+            <wp:cNvGraphicFramePr>
+              <a:graphicFrameLocks xmlns:a="http://schemas.openxmlformats.org/drawingml/2006/main" noChangeAspect="1"/>
+            </wp:cNvGraphicFramePr>
+            <a:graphic xmlns:a="http://schemas.openxmlformats.org/drawingml/2006/main">
+              <a:graphicData uri="http://schemas.openxmlformats.org/drawingml/2006/picture">
+                <pic:pic xmlns:pic="http://schemas.openxmlformats.org/drawingml/2006/picture">
+                  <pic:nvPicPr>
+                    <pic:cNvPr id="903310017" name=""/>
+                    <pic:cNvPicPr/>
+                  </pic:nvPicPr>
+                  <pic:blipFill>
+                    <a:blip r:embed="rId18"/>
+                    <a:stretch>
+                      <a:fillRect/>
+                    </a:stretch>
+                  </pic:blipFill>
+                  <pic:spPr>
+                    <a:xfrm>
+                      <a:off x="0" y="0"/>
+                      <a:ext cx="4648849" cy="3296110"/>
+                    </a:xfrm>
+                    <a:prstGeom prst="rect">
+                      <a:avLst/>
+                    </a:prstGeom>
+                  </pic:spPr>
+                </pic:pic>
+              </a:graphicData>
+            </a:graphic>
+          </wp:inline>
+        </w:drawing>
+      </w:r>
+    </w:p>
+    <w:p>
+      <w:pPr>
+        <w:pStyle w:val="a"/>
+      </w:pPr>
+      <w:r>
+        <w:t>Обнаружение антиотладочного метода, измеряющий время.</w:t>
+      </w:r>
+    </w:p>
+    <w:p/>
+    <w:p>
+      <w:pPr>
+        <w:rPr>
+          <w:lang w:val="en-US"/>
+        </w:rPr>
+      </w:pPr>
+      <w:r>
+        <w:t xml:space="preserve">Для обхода данного метода можно удалить деление на 0, заменив его на </w:t>
+      </w:r>
+      <w:proofErr w:type="spellStart"/>
+      <w:r>
+        <w:rPr>
+          <w:lang w:val="en-US"/>
+        </w:rPr>
+        <w:t>nop</w:t>
+      </w:r>
+      <w:proofErr w:type="spellEnd"/>
+      <w:r>
+        <w:t>.</w:t>
+      </w:r>
+    </w:p>
+    <w:p>
+      <w:pPr>
+        <w:pStyle w:val="a8"/>
+        <w:rPr>
+          <w:lang w:val="en-US"/>
+        </w:rPr>
+      </w:pPr>
+      <w:r>
+        <w:rPr>
+          <w:lang w:val="en-US"/>
+        </w:rPr>
+        <w:drawing>
+          <wp:inline distT="0" distB="0" distL="0" distR="0" wp14:anchorId="54C7C9F3" wp14:editId="0F9B44A0">
+            <wp:extent cx="3258005" cy="2362530"/>
+            <wp:effectExtent l="0" t="0" r="0" b="0"/>
+            <wp:docPr id="1806029479" name="Picture 1"/>
+            <wp:cNvGraphicFramePr>
+              <a:graphicFrameLocks xmlns:a="http://schemas.openxmlformats.org/drawingml/2006/main" noChangeAspect="1"/>
+            </wp:cNvGraphicFramePr>
+            <a:graphic xmlns:a="http://schemas.openxmlformats.org/drawingml/2006/main">
+              <a:graphicData uri="http://schemas.openxmlformats.org/drawingml/2006/picture">
+                <pic:pic xmlns:pic="http://schemas.openxmlformats.org/drawingml/2006/picture">
+                  <pic:nvPicPr>
+                    <pic:cNvPr id="1806029479" name=""/>
+                    <pic:cNvPicPr/>
+                  </pic:nvPicPr>
+                  <pic:blipFill>
+                    <a:blip r:embed="rId19"/>
+                    <a:stretch>
+                      <a:fillRect/>
+                    </a:stretch>
+                  </pic:blipFill>
+                  <pic:spPr>
+                    <a:xfrm>
+                      <a:off x="0" y="0"/>
+                      <a:ext cx="3258005" cy="2362530"/>
+                    </a:xfrm>
+                    <a:prstGeom prst="rect">
+                      <a:avLst/>
+                    </a:prstGeom>
+                  </pic:spPr>
+                </pic:pic>
+              </a:graphicData>
+            </a:graphic>
+          </wp:inline>
+        </w:drawing>
+      </w:r>
+    </w:p>
+    <w:p>
+      <w:pPr>
+        <w:pStyle w:val="a"/>
+      </w:pPr>
+      <w:r>
+        <w:t>Модификация данного метода защиты</w:t>
+      </w:r>
+    </w:p>
+    <w:p/>
+    <w:p>
+      <w:r>
+        <w:t>Также было убрано деление на 0 сразу после считывания пароля при обнаружении отладчика.</w:t>
+      </w:r>
+    </w:p>
+    <w:p/>
+    <w:p>
+      <w:pPr>
+        <w:pStyle w:val="a8"/>
+      </w:pPr>
+      <w:r>
+        <w:lastRenderedPageBreak/>
+        <w:drawing>
+          <wp:inline distT="0" distB="0" distL="0" distR="0" wp14:anchorId="071F8533" wp14:editId="5F45A52E">
+            <wp:extent cx="3801005" cy="2095792"/>
+            <wp:effectExtent l="0" t="0" r="9525" b="0"/>
+            <wp:docPr id="727508324" name="Picture 1"/>
+            <wp:cNvGraphicFramePr>
+              <a:graphicFrameLocks xmlns:a="http://schemas.openxmlformats.org/drawingml/2006/main" noChangeAspect="1"/>
+            </wp:cNvGraphicFramePr>
+            <a:graphic xmlns:a="http://schemas.openxmlformats.org/drawingml/2006/main">
+              <a:graphicData uri="http://schemas.openxmlformats.org/drawingml/2006/picture">
+                <pic:pic xmlns:pic="http://schemas.openxmlformats.org/drawingml/2006/picture">
+                  <pic:nvPicPr>
+                    <pic:cNvPr id="727508324" name=""/>
+                    <pic:cNvPicPr/>
+                  </pic:nvPicPr>
+                  <pic:blipFill>
+                    <a:blip r:embed="rId20"/>
+                    <a:stretch>
+                      <a:fillRect/>
+                    </a:stretch>
+                  </pic:blipFill>
+                  <pic:spPr>
+                    <a:xfrm>
+                      <a:off x="0" y="0"/>
+                      <a:ext cx="3801005" cy="2095792"/>
+                    </a:xfrm>
+                    <a:prstGeom prst="rect">
+                      <a:avLst/>
+                    </a:prstGeom>
+                  </pic:spPr>
+                </pic:pic>
+              </a:graphicData>
+            </a:graphic>
+          </wp:inline>
+        </w:drawing>
+      </w:r>
+    </w:p>
+    <w:p>
+      <w:pPr>
+        <w:pStyle w:val="a"/>
+      </w:pPr>
+      <w:r>
+        <w:t xml:space="preserve">Замена </w:t>
+      </w:r>
+      <w:r>
+        <w:rPr>
+          <w:lang w:val="en-US"/>
+        </w:rPr>
+        <w:t>div</w:t>
+      </w:r>
+      <w:r>
+        <w:t xml:space="preserve"> </w:t>
+      </w:r>
+      <w:r>
+        <w:rPr>
+          <w:lang w:val="en-US"/>
+        </w:rPr>
+        <w:t>ch</w:t>
+      </w:r>
+      <w:r>
+        <w:t xml:space="preserve"> </w:t>
+      </w:r>
+      <w:r>
+        <w:t xml:space="preserve">на </w:t>
+      </w:r>
+      <w:proofErr w:type="spellStart"/>
+      <w:r>
+        <w:rPr>
+          <w:lang w:val="en-US"/>
+        </w:rPr>
+        <w:t>nop</w:t>
+      </w:r>
+      <w:proofErr w:type="spellEnd"/>
+    </w:p>
+    <w:p>
+      <w:r>
+        <w:t>После применения патчей, во время отладки удалось достигнуть точки ввода пароля.</w:t>
+      </w:r>
+    </w:p>
+    <w:p/>
+    <w:p>
+      <w:pPr>
+        <w:pStyle w:val="a8"/>
+      </w:pPr>
+      <w:r>
+        <w:drawing>
+          <wp:inline distT="0" distB="0" distL="0" distR="0" wp14:anchorId="4173B5A3" wp14:editId="0F0BF5A0">
+            <wp:extent cx="6300470" cy="2723515"/>
+            <wp:effectExtent l="0" t="0" r="0" b="0"/>
+            <wp:docPr id="485233184" name="Picture 1"/>
+            <wp:cNvGraphicFramePr>
+              <a:graphicFrameLocks xmlns:a="http://schemas.openxmlformats.org/drawingml/2006/main" noChangeAspect="1"/>
+            </wp:cNvGraphicFramePr>
+            <a:graphic xmlns:a="http://schemas.openxmlformats.org/drawingml/2006/main">
+              <a:graphicData uri="http://schemas.openxmlformats.org/drawingml/2006/picture">
+                <pic:pic xmlns:pic="http://schemas.openxmlformats.org/drawingml/2006/picture">
+                  <pic:nvPicPr>
+                    <pic:cNvPr id="485233184" name=""/>
+                    <pic:cNvPicPr/>
+                  </pic:nvPicPr>
+                  <pic:blipFill>
+                    <a:blip r:embed="rId21"/>
+                    <a:stretch>
+                      <a:fillRect/>
+                    </a:stretch>
+                  </pic:blipFill>
+                  <pic:spPr>
+                    <a:xfrm>
+                      <a:off x="0" y="0"/>
+                      <a:ext cx="6300470" cy="2723515"/>
+                    </a:xfrm>
+                    <a:prstGeom prst="rect">
+                      <a:avLst/>
+                    </a:prstGeom>
+                  </pic:spPr>
+                </pic:pic>
+              </a:graphicData>
+            </a:graphic>
+          </wp:inline>
+        </w:drawing>
+      </w:r>
+    </w:p>
+    <w:p>
+      <w:pPr>
+        <w:pStyle w:val="a"/>
+      </w:pPr>
+      <w:r>
+        <w:t>Изменение поведения отладки</w:t>
+      </w:r>
+    </w:p>
+    <w:p>
+      <w:pPr>
+        <w:ind w:firstLine="0"/>
+      </w:pPr>
+    </w:p>
+    <w:p>
+      <w:r>
+        <w:t>Также был обнаружен участок, который не до конца был переведен в код дизасемблером, после второй проверки на отладку. В данном участке можно заметить переход по адрессу, до которого не может добраться дизасемблер.</w:t>
+      </w:r>
+    </w:p>
+    <w:p>
+      <w:pPr>
+        <w:ind w:firstLine="0"/>
+      </w:pPr>
+    </w:p>
+    <w:p>
+      <w:pPr>
+        <w:pStyle w:val="a8"/>
+      </w:pPr>
+      <w:r>
+        <w:lastRenderedPageBreak/>
+        <w:drawing>
+          <wp:inline distT="0" distB="0" distL="0" distR="0" wp14:anchorId="32611BA1" wp14:editId="5DEC2D7F">
+            <wp:extent cx="6300470" cy="3735705"/>
+            <wp:effectExtent l="0" t="0" r="0" b="0"/>
+            <wp:docPr id="104530973" name="Picture 1"/>
+            <wp:cNvGraphicFramePr>
+              <a:graphicFrameLocks xmlns:a="http://schemas.openxmlformats.org/drawingml/2006/main" noChangeAspect="1"/>
+            </wp:cNvGraphicFramePr>
+            <a:graphic xmlns:a="http://schemas.openxmlformats.org/drawingml/2006/main">
+              <a:graphicData uri="http://schemas.openxmlformats.org/drawingml/2006/picture">
+                <pic:pic xmlns:pic="http://schemas.openxmlformats.org/drawingml/2006/picture">
+                  <pic:nvPicPr>
+                    <pic:cNvPr id="104530973" name=""/>
+                    <pic:cNvPicPr/>
+                  </pic:nvPicPr>
+                  <pic:blipFill>
+                    <a:blip r:embed="rId22"/>
+                    <a:stretch>
+                      <a:fillRect/>
+                    </a:stretch>
+                  </pic:blipFill>
+                  <pic:spPr>
+                    <a:xfrm>
+                      <a:off x="0" y="0"/>
+                      <a:ext cx="6300470" cy="3735705"/>
+                    </a:xfrm>
+                    <a:prstGeom prst="rect">
+                      <a:avLst/>
+                    </a:prstGeom>
+                  </pic:spPr>
+                </pic:pic>
+              </a:graphicData>
+            </a:graphic>
+          </wp:inline>
+        </w:drawing>
+      </w:r>
+    </w:p>
+    <w:p>
+      <w:pPr>
+        <w:pStyle w:val="a"/>
+      </w:pPr>
+      <w:r>
+        <w:t>Не дизасемблированный участок.</w:t>
+      </w:r>
+    </w:p>
+    <w:p/>
+    <w:p>
+      <w:r>
+        <w:t xml:space="preserve">При анализе можно увидеть что </w:t>
+      </w:r>
+      <w:r>
+        <w:t xml:space="preserve">в метке </w:t>
+      </w:r>
+      <w:r>
+        <w:rPr>
+          <w:lang w:val="en-US"/>
+        </w:rPr>
+        <w:t>loc</w:t>
+      </w:r>
+      <w:r>
+        <w:t>_</w:t>
+      </w:r>
+      <w:r>
+        <w:rPr>
+          <w:lang w:val="en-US"/>
+        </w:rPr>
+        <w:t>F</w:t>
+      </w:r>
+      <w:r>
+        <w:t>31</w:t>
+      </w:r>
+      <w:r>
+        <w:rPr>
+          <w:lang w:val="en-US"/>
+        </w:rPr>
+        <w:t>A</w:t>
+      </w:r>
+      <w:r>
+        <w:t>8</w:t>
+      </w:r>
+      <w:r>
+        <w:rPr>
+          <w:lang w:val="en-US"/>
+        </w:rPr>
+        <w:t>E</w:t>
+      </w:r>
+      <w:r>
+        <w:t xml:space="preserve"> </w:t>
+      </w:r>
+      <w:r>
+        <w:t xml:space="preserve">происходит гарантированный переход на </w:t>
+      </w:r>
+      <w:r>
+        <w:rPr>
+          <w:lang w:val="en-US"/>
+        </w:rPr>
+        <w:t>loc</w:t>
+      </w:r>
+      <w:r>
+        <w:t>_</w:t>
+      </w:r>
+      <w:r>
+        <w:rPr>
+          <w:lang w:val="en-US"/>
+        </w:rPr>
+        <w:t>F</w:t>
+      </w:r>
+      <w:r>
+        <w:t>31</w:t>
+      </w:r>
+      <w:r>
+        <w:rPr>
+          <w:lang w:val="en-US"/>
+        </w:rPr>
+        <w:t>A</w:t>
+      </w:r>
+      <w:r>
+        <w:t xml:space="preserve">92 </w:t>
+      </w:r>
+      <w:r>
+        <w:t>со смещением на 2 байта, но в пространстве не отображается адрес 00</w:t>
+      </w:r>
+      <w:r>
+        <w:rPr>
+          <w:lang w:val="en-US"/>
+        </w:rPr>
+        <w:t>F</w:t>
+      </w:r>
+      <w:r>
+        <w:t>31</w:t>
+      </w:r>
+      <w:r>
+        <w:rPr>
+          <w:lang w:val="en-US"/>
+        </w:rPr>
+        <w:t>A</w:t>
+      </w:r>
+      <w:r>
+        <w:t>92</w:t>
+      </w:r>
+      <w:r>
+        <w:t xml:space="preserve"> + 2 (00</w:t>
+      </w:r>
+      <w:r>
+        <w:rPr>
+          <w:lang w:val="en-US"/>
+        </w:rPr>
+        <w:t>F</w:t>
+      </w:r>
+      <w:r>
+        <w:t>31</w:t>
+      </w:r>
+      <w:r>
+        <w:rPr>
+          <w:lang w:val="en-US"/>
+        </w:rPr>
+        <w:t>A</w:t>
+      </w:r>
+      <w:r>
+        <w:t>9</w:t>
+      </w:r>
+      <w:r>
+        <w:t xml:space="preserve">4). Для этого необходимо снять опередение данных с данного адреса можно заметить, что адрес </w:t>
+      </w:r>
+      <w:r>
+        <w:t>00</w:t>
+      </w:r>
+      <w:r>
+        <w:rPr>
+          <w:lang w:val="en-US"/>
+        </w:rPr>
+        <w:t>F</w:t>
+      </w:r>
+      <w:r>
+        <w:t>31</w:t>
+      </w:r>
+      <w:r>
+        <w:rPr>
+          <w:lang w:val="en-US"/>
+        </w:rPr>
+        <w:t>A</w:t>
+      </w:r>
+      <w:r>
+        <w:t>9</w:t>
+      </w:r>
+      <w:r>
+        <w:t>4</w:t>
+      </w:r>
+      <w:r>
+        <w:t xml:space="preserve"> появился в пространстве и при идентификации данных в код (С) можно увидеть, что по этому адресу находилась метка </w:t>
+      </w:r>
+      <w:r>
+        <w:t>00</w:t>
+      </w:r>
+      <w:r>
+        <w:rPr>
+          <w:lang w:val="en-US"/>
+        </w:rPr>
+        <w:t>F</w:t>
+      </w:r>
+      <w:r>
+        <w:t>31</w:t>
+      </w:r>
+      <w:r>
+        <w:rPr>
+          <w:lang w:val="en-US"/>
+        </w:rPr>
+        <w:t>A</w:t>
+      </w:r>
+      <w:r>
+        <w:t>9</w:t>
+      </w:r>
+      <w:r>
+        <w:t>4</w:t>
+      </w:r>
+      <w:r>
+        <w:t>.</w:t>
+      </w:r>
+    </w:p>
+    <w:p>
+      <w:pPr>
+        <w:pStyle w:val="a8"/>
+      </w:pPr>
+      <w:r>
+        <w:lastRenderedPageBreak/>
+        <w:drawing>
+          <wp:inline distT="0" distB="0" distL="0" distR="0" wp14:anchorId="5067B244" wp14:editId="377A7092">
+            <wp:extent cx="6300470" cy="3940810"/>
+            <wp:effectExtent l="0" t="0" r="0" b="0"/>
+            <wp:docPr id="347668606" name="Picture 1"/>
+            <wp:cNvGraphicFramePr>
+              <a:graphicFrameLocks xmlns:a="http://schemas.openxmlformats.org/drawingml/2006/main" noChangeAspect="1"/>
+            </wp:cNvGraphicFramePr>
+            <a:graphic xmlns:a="http://schemas.openxmlformats.org/drawingml/2006/main">
+              <a:graphicData uri="http://schemas.openxmlformats.org/drawingml/2006/picture">
+                <pic:pic xmlns:pic="http://schemas.openxmlformats.org/drawingml/2006/picture">
+                  <pic:nvPicPr>
+                    <pic:cNvPr id="347668606" name=""/>
+                    <pic:cNvPicPr/>
+                  </pic:nvPicPr>
+                  <pic:blipFill>
+                    <a:blip r:embed="rId23"/>
+                    <a:stretch>
+                      <a:fillRect/>
+                    </a:stretch>
+                  </pic:blipFill>
+                  <pic:spPr>
+                    <a:xfrm>
+                      <a:off x="0" y="0"/>
+                      <a:ext cx="6300470" cy="3940810"/>
+                    </a:xfrm>
+                    <a:prstGeom prst="rect">
+                      <a:avLst/>
+                    </a:prstGeom>
+                  </pic:spPr>
+                </pic:pic>
+              </a:graphicData>
+            </a:graphic>
+          </wp:inline>
+        </w:drawing>
+      </w:r>
+    </w:p>
+    <w:p>
+      <w:pPr>
+        <w:pStyle w:val="a"/>
+        <w:rPr>
+          <w:lang w:val="en-US"/>
+        </w:rPr>
+      </w:pPr>
+      <w:r>
+        <w:t>Раскрытие метки по адресу 00</w:t>
+      </w:r>
+      <w:r>
+        <w:rPr>
+          <w:lang w:val="en-US"/>
+        </w:rPr>
+        <w:t>F</w:t>
+      </w:r>
+      <w:r>
+        <w:t>31</w:t>
+      </w:r>
+      <w:r>
+        <w:rPr>
+          <w:lang w:val="en-US"/>
+        </w:rPr>
+        <w:t>A</w:t>
+      </w:r>
+      <w:r>
+        <w:t>94</w:t>
+      </w:r>
+    </w:p>
+    <w:p>
+      <w:pPr>
+        <w:rPr>
+          <w:lang w:val="en-US"/>
+        </w:rPr>
+      </w:pPr>
+    </w:p>
+    <w:p>
+      <w:r>
+        <w:t xml:space="preserve">Далее можно увидеть вызов исключения с проверкой символа на </w:t>
+      </w:r>
+      <w:r>
+        <w:rPr>
+          <w:i/>
+          <w:iCs/>
+          <w:lang w:val="en-US"/>
+        </w:rPr>
+        <w:t>j</w:t>
+      </w:r>
+      <w:r>
+        <w:t xml:space="preserve">, что обходится изменением </w:t>
+      </w:r>
+      <w:proofErr w:type="spellStart"/>
+      <w:r>
+        <w:rPr>
+          <w:lang w:val="en-US"/>
+        </w:rPr>
+        <w:t>jnz</w:t>
+      </w:r>
+      <w:proofErr w:type="spellEnd"/>
+      <w:r>
+        <w:t xml:space="preserve"> -&gt; </w:t>
+      </w:r>
+      <w:proofErr w:type="spellStart"/>
+      <w:r>
+        <w:rPr>
+          <w:lang w:val="en-US"/>
+        </w:rPr>
+        <w:t>jz</w:t>
+      </w:r>
+      <w:proofErr w:type="spellEnd"/>
+      <w:r>
+        <w:t xml:space="preserve">, </w:t>
+      </w:r>
+      <w:r>
+        <w:t>как показано на рисунке выше.</w:t>
+      </w:r>
+    </w:p>
+    <w:p>
+      <w:r>
+        <w:t>Предварительно была определена функция проверки пароля, внутри которой были поставлены тестовые точки остановки, чтобы проверить досягаемоть до нее во время отладки. После изменения еще нескольких механизмов антиотладки функция проверки была достигнута в отладке.</w:t>
+      </w:r>
+    </w:p>
+    <w:p>
+      <w:pPr>
+        <w:pStyle w:val="a8"/>
+      </w:pPr>
+      <w:r>
+        <w:lastRenderedPageBreak/>
+        <w:drawing>
+          <wp:inline distT="0" distB="0" distL="0" distR="0" wp14:anchorId="0EE56ED8" wp14:editId="12DA0673">
+            <wp:extent cx="4153480" cy="4991797"/>
+            <wp:effectExtent l="0" t="0" r="0" b="0"/>
+            <wp:docPr id="1460138404" name="Picture 1"/>
+            <wp:cNvGraphicFramePr>
+              <a:graphicFrameLocks xmlns:a="http://schemas.openxmlformats.org/drawingml/2006/main" noChangeAspect="1"/>
+            </wp:cNvGraphicFramePr>
+            <a:graphic xmlns:a="http://schemas.openxmlformats.org/drawingml/2006/main">
+              <a:graphicData uri="http://schemas.openxmlformats.org/drawingml/2006/picture">
+                <pic:pic xmlns:pic="http://schemas.openxmlformats.org/drawingml/2006/picture">
+                  <pic:nvPicPr>
+                    <pic:cNvPr id="1460138404" name=""/>
+                    <pic:cNvPicPr/>
+                  </pic:nvPicPr>
+                  <pic:blipFill>
+                    <a:blip r:embed="rId24"/>
+                    <a:stretch>
+                      <a:fillRect/>
+                    </a:stretch>
+                  </pic:blipFill>
+                  <pic:spPr>
+                    <a:xfrm>
+                      <a:off x="0" y="0"/>
+                      <a:ext cx="4153480" cy="4991797"/>
+                    </a:xfrm>
+                    <a:prstGeom prst="rect">
+                      <a:avLst/>
+                    </a:prstGeom>
+                  </pic:spPr>
+                </pic:pic>
+              </a:graphicData>
+            </a:graphic>
+          </wp:inline>
+        </w:drawing>
+      </w:r>
+    </w:p>
+    <w:p>
+      <w:pPr>
+        <w:pStyle w:val="a"/>
+      </w:pPr>
+      <w:r>
+        <w:t>Функция првоерки пароля в отладке.</w:t>
+      </w:r>
+    </w:p>
+    <w:p>
+      <w:pPr>
+        <w:rPr>
+          <w:lang w:val="en-US"/>
+        </w:rPr>
+      </w:pPr>
+    </w:p>
+    <w:p>
+      <w:r>
+        <w:t>В данной фун</w:t>
+      </w:r>
+      <w:r>
+        <w:t>кции введеный пароль шифруется по алгоритму с ключом и шаблоном перобраозваний. В начале шифротекст пароля берется из памяти, который можно прочитать.</w:t>
+      </w:r>
+    </w:p>
+    <w:p/>
+    <w:p>
+      <w:pPr>
+        <w:pStyle w:val="a8"/>
+      </w:pPr>
+      <w:r>
+        <w:lastRenderedPageBreak/>
+        <w:drawing>
+          <wp:inline distT="0" distB="0" distL="0" distR="0" wp14:anchorId="3F55B85D" wp14:editId="59FE01A4">
+            <wp:extent cx="6300470" cy="5466715"/>
+            <wp:effectExtent l="0" t="0" r="0" b="0"/>
+            <wp:docPr id="1719684864" name="Picture 1"/>
+            <wp:cNvGraphicFramePr>
+              <a:graphicFrameLocks xmlns:a="http://schemas.openxmlformats.org/drawingml/2006/main" noChangeAspect="1"/>
+            </wp:cNvGraphicFramePr>
+            <a:graphic xmlns:a="http://schemas.openxmlformats.org/drawingml/2006/main">
+              <a:graphicData uri="http://schemas.openxmlformats.org/drawingml/2006/picture">
+                <pic:pic xmlns:pic="http://schemas.openxmlformats.org/drawingml/2006/picture">
+                  <pic:nvPicPr>
+                    <pic:cNvPr id="1719684864" name=""/>
+                    <pic:cNvPicPr/>
+                  </pic:nvPicPr>
+                  <pic:blipFill>
+                    <a:blip r:embed="rId25"/>
+                    <a:stretch>
+                      <a:fillRect/>
+                    </a:stretch>
+                  </pic:blipFill>
+                  <pic:spPr>
+                    <a:xfrm>
+                      <a:off x="0" y="0"/>
+                      <a:ext cx="6300470" cy="5466715"/>
+                    </a:xfrm>
+                    <a:prstGeom prst="rect">
+                      <a:avLst/>
+                    </a:prstGeom>
+                  </pic:spPr>
+                </pic:pic>
+              </a:graphicData>
+            </a:graphic>
+          </wp:inline>
+        </w:drawing>
+      </w:r>
+    </w:p>
+    <w:p>
+      <w:pPr>
+        <w:pStyle w:val="a"/>
+      </w:pPr>
+      <w:r>
+        <w:t>Шифротекст исходного пароля в памяти.</w:t>
+      </w:r>
+    </w:p>
+    <w:p/>
+    <w:p>
+      <w:pPr>
+        <w:rPr>
+          <w:lang w:val="en-US"/>
+        </w:rPr>
+      </w:pPr>
+      <w:r>
+        <w:t>Для получения исходного пароля была восоздана функция обратных шифрованию действий и был получен вероятный верный пароль.</w:t>
+      </w:r>
+    </w:p>
+    <w:p>
+      <w:pPr>
+        <w:pStyle w:val="a8"/>
+        <w:rPr>
+          <w:lang w:val="en-US"/>
+        </w:rPr>
+      </w:pPr>
+      <w:r>
+        <w:rPr>
+          <w:lang w:val="en-US"/>
+        </w:rPr>
+        <w:lastRenderedPageBreak/>
+        <w:drawing>
+          <wp:inline distT="0" distB="0" distL="0" distR="0" wp14:anchorId="544B6875" wp14:editId="567DB2E4">
+            <wp:extent cx="6300470" cy="5280660"/>
+            <wp:effectExtent l="0" t="0" r="0" b="0"/>
+            <wp:docPr id="161050604" name="Picture 1"/>
+            <wp:cNvGraphicFramePr>
+              <a:graphicFrameLocks xmlns:a="http://schemas.openxmlformats.org/drawingml/2006/main" noChangeAspect="1"/>
+            </wp:cNvGraphicFramePr>
+            <a:graphic xmlns:a="http://schemas.openxmlformats.org/drawingml/2006/main">
+              <a:graphicData uri="http://schemas.openxmlformats.org/drawingml/2006/picture">
+                <pic:pic xmlns:pic="http://schemas.openxmlformats.org/drawingml/2006/picture">
+                  <pic:nvPicPr>
+                    <pic:cNvPr id="161050604" name=""/>
+                    <pic:cNvPicPr/>
+                  </pic:nvPicPr>
+                  <pic:blipFill>
+                    <a:blip r:embed="rId26"/>
+                    <a:stretch>
+                      <a:fillRect/>
+                    </a:stretch>
+                  </pic:blipFill>
+                  <pic:spPr>
+                    <a:xfrm>
+                      <a:off x="0" y="0"/>
+                      <a:ext cx="6300470" cy="5280660"/>
+                    </a:xfrm>
+                    <a:prstGeom prst="rect">
+                      <a:avLst/>
+                    </a:prstGeom>
+                  </pic:spPr>
+                </pic:pic>
+              </a:graphicData>
+            </a:graphic>
+          </wp:inline>
+        </w:drawing>
+      </w:r>
+    </w:p>
+    <w:p>
+      <w:pPr>
+        <w:pStyle w:val="a"/>
+      </w:pPr>
+      <w:r>
+        <w:t>Воссозданная дешифрующая функция с вероятным паролем.</w:t>
+      </w:r>
+    </w:p>
+    <w:p/>
+    <w:p>
+      <w:r>
+        <w:t xml:space="preserve">Из реставрации функции шифрования ввода была получена строка </w:t>
+      </w:r>
+      <w:r>
+        <w:t>SuoerSe`retBackdnnrPassvnrd0132446789</w:t>
+      </w:r>
+      <w:r>
+        <w:t xml:space="preserve">, которая при вводе не дала никакого результата. Вспоминая прошлые модификации программы можно вспомнить, что в них была проверка последнего символа на равенство с </w:t>
+      </w:r>
+      <w:r>
+        <w:rPr>
+          <w:i/>
+          <w:iCs/>
+          <w:lang w:val="en-US"/>
+        </w:rPr>
+        <w:t>j</w:t>
+      </w:r>
+      <w:r>
+        <w:t xml:space="preserve">, </w:t>
+      </w:r>
+      <w:r>
+        <w:t xml:space="preserve">которая была изменена. С данным предположением была запущена повторная отладка с полученым паролем, а также еще одним символом кроме </w:t>
+      </w:r>
+      <w:r>
+        <w:rPr>
+          <w:lang w:val="en-US"/>
+        </w:rPr>
+        <w:t>j</w:t>
+      </w:r>
+      <w:r>
+        <w:t xml:space="preserve"> </w:t>
+      </w:r>
+      <w:r>
+        <w:t>и в результате секретный ключ был получен.</w:t>
+      </w:r>
+    </w:p>
+    <w:p>
+      <w:pPr>
+        <w:rPr>
+          <w:lang w:val="en-US"/>
+        </w:rPr>
+      </w:pPr>
+    </w:p>
+    <w:p>
+      <w:pPr>
+        <w:pStyle w:val="a8"/>
+        <w:rPr>
+          <w:lang w:val="en-US"/>
+        </w:rPr>
+      </w:pPr>
+      <w:r>
+        <w:rPr>
+          <w:lang w:val="en-US"/>
+        </w:rPr>
+        <w:lastRenderedPageBreak/>
+        <w:drawing>
+          <wp:inline distT="0" distB="0" distL="0" distR="0" wp14:anchorId="3523D710" wp14:editId="593F4640">
+            <wp:extent cx="6300470" cy="1587500"/>
+            <wp:effectExtent l="0" t="0" r="0" b="0"/>
+            <wp:docPr id="1960259856" name="Picture 1"/>
+            <wp:cNvGraphicFramePr>
+              <a:graphicFrameLocks xmlns:a="http://schemas.openxmlformats.org/drawingml/2006/main" noChangeAspect="1"/>
+            </wp:cNvGraphicFramePr>
+            <a:graphic xmlns:a="http://schemas.openxmlformats.org/drawingml/2006/main">
+              <a:graphicData uri="http://schemas.openxmlformats.org/drawingml/2006/picture">
+                <pic:pic xmlns:pic="http://schemas.openxmlformats.org/drawingml/2006/picture">
+                  <pic:nvPicPr>
+                    <pic:cNvPr id="1960259856" name=""/>
+                    <pic:cNvPicPr/>
+                  </pic:nvPicPr>
+                  <pic:blipFill>
+                    <a:blip r:embed="rId27"/>
+                    <a:stretch>
+                      <a:fillRect/>
+                    </a:stretch>
+                  </pic:blipFill>
+                  <pic:spPr>
+                    <a:xfrm>
+                      <a:off x="0" y="0"/>
+                      <a:ext cx="6300470" cy="1587500"/>
+                    </a:xfrm>
+                    <a:prstGeom prst="rect">
+                      <a:avLst/>
+                    </a:prstGeom>
+                  </pic:spPr>
+                </pic:pic>
+              </a:graphicData>
+            </a:graphic>
+          </wp:inline>
+        </w:drawing>
+      </w:r>
+    </w:p>
+    <w:p>
+      <w:pPr>
+        <w:pStyle w:val="a"/>
+      </w:pPr>
+      <w:r>
+        <w:t>Получение секретного ключа.</w:t>
+      </w:r>
+    </w:p>
+    <w:p/>
+    <w:p>
+      <w:r>
+        <w:rPr>
+          <w:b/>
+          <w:bCs/>
+        </w:rPr>
+        <w:t>Р</w:t>
+      </w:r>
+      <w:r>
+        <w:rPr>
+          <w:b/>
+          <w:bCs/>
+          <w:lang w:val="en-US"/>
+        </w:rPr>
+        <w:t>once</w:t>
+      </w:r>
+      <w:r>
+        <w:rPr>
+          <w:b/>
+          <w:bCs/>
+        </w:rPr>
+        <w:t xml:space="preserve"> – </w:t>
+      </w:r>
+      <w:r>
+        <w:t xml:space="preserve">плагин для </w:t>
+      </w:r>
+      <w:r>
+        <w:rPr>
+          <w:lang w:val="en-US"/>
+        </w:rPr>
+        <w:t>IDA</w:t>
+      </w:r>
+      <w:r>
+        <w:t xml:space="preserve">, </w:t>
+      </w:r>
+      <w:r>
+        <w:t>позволяющий выполнять трассировку динамически и символически исполняет программу во время отладки. Данный плагин динамически отслеживает изменение регистров и позволяет извлекать значения байтов принудительно.</w:t>
+      </w:r>
+    </w:p>
+    <w:p>
+      <w:pPr>
+        <w:rPr>
+          <w:lang w:val="en-US"/>
+        </w:rPr>
+      </w:pPr>
+      <w:r>
+        <w:t xml:space="preserve">Для получения пароля с помощью </w:t>
+      </w:r>
+      <w:r>
+        <w:rPr>
+          <w:lang w:val="en-US"/>
+        </w:rPr>
+        <w:t>ponce</w:t>
+      </w:r>
+      <w:r>
+        <w:t xml:space="preserve"> </w:t>
+      </w:r>
+      <w:r>
+        <w:t xml:space="preserve">была запущена отладка и точка остановы была поставлена сразу после считывания введеного пароля. </w:t>
+      </w:r>
+      <w:r>
+        <w:t xml:space="preserve">Для этого введено 1234567890123456789012345678 как заглушку, но с длинной 38, затем в стеке (в регистре </w:t>
+      </w:r>
+      <w:r>
+        <w:rPr>
+          <w:lang w:val="en-US"/>
+        </w:rPr>
+        <w:t>EBP</w:t>
+      </w:r>
+      <w:r>
+        <w:t xml:space="preserve"> </w:t>
+      </w:r>
+      <w:r>
+        <w:t xml:space="preserve">с отступом) находится место, куда записался ввод. Из стека необходимо достать адрес ввода добавляется в окно памяти через </w:t>
+      </w:r>
+      <w:r>
+        <w:rPr>
+          <w:lang w:val="en-US"/>
+        </w:rPr>
+        <w:t>ponce</w:t>
+      </w:r>
+      <w:r>
+        <w:t>.</w:t>
+      </w:r>
+    </w:p>
+    <w:p>
+      <w:pPr>
+        <w:rPr>
+          <w:lang w:val="en-US"/>
+        </w:rPr>
+      </w:pPr>
+    </w:p>
+    <w:p>
+      <w:pPr>
+        <w:pStyle w:val="a8"/>
+        <w:rPr>
+          <w:lang w:val="en-US"/>
+        </w:rPr>
+      </w:pPr>
+      <w:r>
+        <w:rPr>
+          <w:lang w:val="en-US"/>
+        </w:rPr>
+        <w:drawing>
+          <wp:inline distT="0" distB="0" distL="0" distR="0" wp14:anchorId="00F7161C" wp14:editId="187F3024">
+            <wp:extent cx="6300470" cy="2454910"/>
+            <wp:effectExtent l="0" t="0" r="0" b="0"/>
+            <wp:docPr id="613120428" name="Picture 1"/>
+            <wp:cNvGraphicFramePr>
+              <a:graphicFrameLocks xmlns:a="http://schemas.openxmlformats.org/drawingml/2006/main" noChangeAspect="1"/>
+            </wp:cNvGraphicFramePr>
+            <a:graphic xmlns:a="http://schemas.openxmlformats.org/drawingml/2006/main">
+              <a:graphicData uri="http://schemas.openxmlformats.org/drawingml/2006/picture">
+                <pic:pic xmlns:pic="http://schemas.openxmlformats.org/drawingml/2006/picture">
+                  <pic:nvPicPr>
+                    <pic:cNvPr id="613120428" name=""/>
+                    <pic:cNvPicPr/>
+                  </pic:nvPicPr>
+                  <pic:blipFill>
+                    <a:blip r:embed="rId28"/>
+                    <a:stretch>
+                      <a:fillRect/>
+                    </a:stretch>
+                  </pic:blipFill>
+                  <pic:spPr>
+                    <a:xfrm>
+                      <a:off x="0" y="0"/>
+                      <a:ext cx="6300470" cy="2454910"/>
+                    </a:xfrm>
+                    <a:prstGeom prst="rect">
+                      <a:avLst/>
+                    </a:prstGeom>
+                  </pic:spPr>
+                </pic:pic>
+              </a:graphicData>
+            </a:graphic>
+          </wp:inline>
+        </w:drawing>
+      </w:r>
+    </w:p>
+    <w:p>
+      <w:pPr>
+        <w:pStyle w:val="a"/>
+        <w:rPr>
+          <w:lang w:val="en-US"/>
+        </w:rPr>
+      </w:pPr>
+      <w:r>
+        <w:t xml:space="preserve">Определение ввода в </w:t>
+      </w:r>
+      <w:r>
+        <w:rPr>
+          <w:lang w:val="en-US"/>
+        </w:rPr>
+        <w:t>EBP</w:t>
+      </w:r>
+    </w:p>
+    <w:p>
+      <w:pPr>
+        <w:rPr>
+          <w:lang w:val="en-US"/>
+        </w:rPr>
+      </w:pPr>
+    </w:p>
+    <w:p>
+      <w:r>
+        <w:t>Далее точка остановы была поставлена перед сравнением последнего символа для применения инжектора для получения нужного последнего байта.</w:t>
+      </w:r>
+    </w:p>
+    <w:p>
+      <w:pPr>
+        <w:pStyle w:val="a8"/>
+      </w:pPr>
+      <w:r>
+        <w:lastRenderedPageBreak/>
+        <w:drawing>
+          <wp:inline distT="0" distB="0" distL="0" distR="0" wp14:anchorId="1287E2BA" wp14:editId="0211B571">
+            <wp:extent cx="5687219" cy="3391373"/>
+            <wp:effectExtent l="0" t="0" r="8890" b="0"/>
+            <wp:docPr id="1847478999" name="Picture 1"/>
+            <wp:cNvGraphicFramePr>
+              <a:graphicFrameLocks xmlns:a="http://schemas.openxmlformats.org/drawingml/2006/main" noChangeAspect="1"/>
+            </wp:cNvGraphicFramePr>
+            <a:graphic xmlns:a="http://schemas.openxmlformats.org/drawingml/2006/main">
+              <a:graphicData uri="http://schemas.openxmlformats.org/drawingml/2006/picture">
+                <pic:pic xmlns:pic="http://schemas.openxmlformats.org/drawingml/2006/picture">
+                  <pic:nvPicPr>
+                    <pic:cNvPr id="1847478999" name=""/>
+                    <pic:cNvPicPr/>
+                  </pic:nvPicPr>
+                  <pic:blipFill>
+                    <a:blip r:embed="rId29"/>
+                    <a:stretch>
+                      <a:fillRect/>
+                    </a:stretch>
+                  </pic:blipFill>
+                  <pic:spPr>
+                    <a:xfrm>
+                      <a:off x="0" y="0"/>
+                      <a:ext cx="5687219" cy="3391373"/>
+                    </a:xfrm>
+                    <a:prstGeom prst="rect">
+                      <a:avLst/>
+                    </a:prstGeom>
+                  </pic:spPr>
+                </pic:pic>
+              </a:graphicData>
+            </a:graphic>
+          </wp:inline>
+        </w:drawing>
+      </w:r>
+    </w:p>
+    <w:p>
+      <w:pPr>
+        <w:pStyle w:val="a"/>
+      </w:pPr>
+      <w:r>
+        <w:t>Вторая точка остановы</w:t>
+      </w:r>
+    </w:p>
+    <w:p/>
+    <w:p>
+      <w:r>
+        <w:t xml:space="preserve">Далее точки остановы были установлены в месте шифрования ввода, чтобы получить адрес в </w:t>
+      </w:r>
+      <w:r>
+        <w:rPr>
+          <w:lang w:val="en-US"/>
+        </w:rPr>
+        <w:t>EBP</w:t>
+      </w:r>
+      <w:r>
+        <w:t xml:space="preserve"> </w:t>
+      </w:r>
+      <w:r>
+        <w:t xml:space="preserve">со входными данными перед шифрованием, а также для применения инжектора с целью внедрения введеных данных в адрес исходного пароля и последующего выдавливания </w:t>
+      </w:r>
+      <w:r>
+        <w:t>символов пароля в консоль.</w:t>
+      </w:r>
+    </w:p>
+    <w:p/>
+    <w:p>
+      <w:pPr>
+        <w:pStyle w:val="a8"/>
+      </w:pPr>
+      <w:r>
+        <w:lastRenderedPageBreak/>
+        <w:drawing>
+          <wp:inline distT="0" distB="0" distL="0" distR="0" wp14:anchorId="53DBA0CF" wp14:editId="6A3D4E3A">
+            <wp:extent cx="6300470" cy="5293360"/>
+            <wp:effectExtent l="0" t="0" r="0" b="0"/>
+            <wp:docPr id="1529781421" name="Picture 1"/>
+            <wp:cNvGraphicFramePr>
+              <a:graphicFrameLocks xmlns:a="http://schemas.openxmlformats.org/drawingml/2006/main" noChangeAspect="1"/>
+            </wp:cNvGraphicFramePr>
+            <a:graphic xmlns:a="http://schemas.openxmlformats.org/drawingml/2006/main">
+              <a:graphicData uri="http://schemas.openxmlformats.org/drawingml/2006/picture">
+                <pic:pic xmlns:pic="http://schemas.openxmlformats.org/drawingml/2006/picture">
+                  <pic:nvPicPr>
+                    <pic:cNvPr id="1529781421" name=""/>
+                    <pic:cNvPicPr/>
+                  </pic:nvPicPr>
+                  <pic:blipFill>
+                    <a:blip r:embed="rId30"/>
+                    <a:stretch>
+                      <a:fillRect/>
+                    </a:stretch>
+                  </pic:blipFill>
+                  <pic:spPr>
+                    <a:xfrm>
+                      <a:off x="0" y="0"/>
+                      <a:ext cx="6300470" cy="5293360"/>
+                    </a:xfrm>
+                    <a:prstGeom prst="rect">
+                      <a:avLst/>
+                    </a:prstGeom>
+                  </pic:spPr>
+                </pic:pic>
+              </a:graphicData>
+            </a:graphic>
+          </wp:inline>
+        </w:drawing>
+      </w:r>
+    </w:p>
+    <w:p>
+      <w:pPr>
+        <w:pStyle w:val="a"/>
+      </w:pPr>
+      <w:r>
+        <w:t>Точки остановы в месте записи входных данных.</w:t>
+      </w:r>
+    </w:p>
+    <w:p/>
+    <w:p>
+      <w:r>
+        <w:t xml:space="preserve">Во время самой отладки, после символизирования введеных данных и применения инжектора в место после сравнения на </w:t>
+      </w:r>
+      <w:r>
+        <w:rPr>
+          <w:lang w:val="en-US"/>
+        </w:rPr>
+        <w:t>j</w:t>
+      </w:r>
+      <w:r>
+        <w:t xml:space="preserve"> было определено место записи введеных данных перед их шифрованием. После полного переноса данных в адресс </w:t>
+      </w:r>
+      <w:proofErr w:type="spellStart"/>
+      <w:r>
+        <w:rPr>
+          <w:lang w:val="en-US"/>
+        </w:rPr>
+        <w:t>ebp</w:t>
+      </w:r>
+      <w:proofErr w:type="spellEnd"/>
+      <w:r>
+        <w:t>+</w:t>
+      </w:r>
+      <w:proofErr w:type="spellStart"/>
+      <w:r>
+        <w:rPr>
+          <w:lang w:val="en-US"/>
+        </w:rPr>
+        <w:t>ecx</w:t>
+      </w:r>
+      <w:proofErr w:type="spellEnd"/>
+      <w:r>
+        <w:t>+</w:t>
+      </w:r>
+      <w:r>
+        <w:rPr>
+          <w:lang w:val="en-US"/>
+        </w:rPr>
+        <w:t>var</w:t>
+      </w:r>
+      <w:r>
+        <w:t>_2</w:t>
+      </w:r>
+      <w:r>
+        <w:rPr>
+          <w:lang w:val="en-US"/>
+        </w:rPr>
+        <w:t>C</w:t>
+      </w:r>
+      <w:r>
+        <w:t xml:space="preserve"> важно выполнить символизацию данных на следующей пересылке в </w:t>
+      </w:r>
+      <w:proofErr w:type="spellStart"/>
+      <w:r>
+        <w:rPr>
+          <w:lang w:val="en-US"/>
+        </w:rPr>
+        <w:t>ebp</w:t>
+      </w:r>
+      <w:proofErr w:type="spellEnd"/>
+      <w:r>
+        <w:t xml:space="preserve"> </w:t>
+      </w:r>
+      <w:r>
+        <w:t xml:space="preserve">по адресу введеных данных. </w:t>
+      </w:r>
+    </w:p>
+    <w:p/>
+    <w:p/>
+    <w:p>
+      <w:pPr>
+        <w:pStyle w:val="a8"/>
+      </w:pPr>
+      <w:r>
+        <w:lastRenderedPageBreak/>
+        <w:drawing>
+          <wp:inline distT="0" distB="0" distL="0" distR="0" wp14:anchorId="144AE052" wp14:editId="18ABBFF3">
+            <wp:extent cx="6300470" cy="3025775"/>
+            <wp:effectExtent l="0" t="0" r="0" b="0"/>
+            <wp:docPr id="1909097380" name="Picture 1"/>
+            <wp:cNvGraphicFramePr>
+              <a:graphicFrameLocks xmlns:a="http://schemas.openxmlformats.org/drawingml/2006/main" noChangeAspect="1"/>
+            </wp:cNvGraphicFramePr>
+            <a:graphic xmlns:a="http://schemas.openxmlformats.org/drawingml/2006/main">
+              <a:graphicData uri="http://schemas.openxmlformats.org/drawingml/2006/picture">
+                <pic:pic xmlns:pic="http://schemas.openxmlformats.org/drawingml/2006/picture">
+                  <pic:nvPicPr>
+                    <pic:cNvPr id="1909097380" name=""/>
+                    <pic:cNvPicPr/>
+                  </pic:nvPicPr>
+                  <pic:blipFill>
+                    <a:blip r:embed="rId31"/>
+                    <a:stretch>
+                      <a:fillRect/>
+                    </a:stretch>
+                  </pic:blipFill>
+                  <pic:spPr>
+                    <a:xfrm>
+                      <a:off x="0" y="0"/>
+                      <a:ext cx="6300470" cy="3025775"/>
+                    </a:xfrm>
+                    <a:prstGeom prst="rect">
+                      <a:avLst/>
+                    </a:prstGeom>
+                  </pic:spPr>
+                </pic:pic>
+              </a:graphicData>
+            </a:graphic>
+          </wp:inline>
+        </w:drawing>
+      </w:r>
+    </w:p>
+    <w:p>
+      <w:pPr>
+        <w:pStyle w:val="a"/>
+      </w:pPr>
+      <w:r>
+        <w:t>Символизирование входных данных перед шифрованием.</w:t>
+      </w:r>
+    </w:p>
+    <w:p>
+      <w:r>
+        <w:t>В дальнейшем, на точке останова, где происходит сравнение зашифрованн</w:t>
+      </w:r>
+      <w:r>
+        <w:t>ых входных данных и шифробайтов исходного пароля применяется инжектор, который выдавливает следующий символ исходного пароля. В ходе инжектирования всех 38 байтов, исходный пароль был получен в консоли.</w:t>
+      </w:r>
+    </w:p>
+    <w:p>
+      <w:pPr>
+        <w:ind w:firstLine="0"/>
+      </w:pPr>
+    </w:p>
+    <w:p>
+      <w:pPr>
+        <w:pStyle w:val="a8"/>
+      </w:pPr>
+      <w:r>
+        <w:drawing>
+          <wp:inline distT="0" distB="0" distL="0" distR="0" wp14:anchorId="1F3F123C" wp14:editId="08CF4E5E">
+            <wp:extent cx="6300470" cy="2487295"/>
+            <wp:effectExtent l="0" t="0" r="0" b="0"/>
+            <wp:docPr id="83088337" name="Picture 1"/>
+            <wp:cNvGraphicFramePr>
+              <a:graphicFrameLocks xmlns:a="http://schemas.openxmlformats.org/drawingml/2006/main" noChangeAspect="1"/>
+            </wp:cNvGraphicFramePr>
+            <a:graphic xmlns:a="http://schemas.openxmlformats.org/drawingml/2006/main">
+              <a:graphicData uri="http://schemas.openxmlformats.org/drawingml/2006/picture">
+                <pic:pic xmlns:pic="http://schemas.openxmlformats.org/drawingml/2006/picture">
+                  <pic:nvPicPr>
+                    <pic:cNvPr id="83088337" name=""/>
+                    <pic:cNvPicPr/>
+                  </pic:nvPicPr>
+                  <pic:blipFill>
+                    <a:blip r:embed="rId32"/>
+                    <a:stretch>
+                      <a:fillRect/>
+                    </a:stretch>
+                  </pic:blipFill>
+                  <pic:spPr>
+                    <a:xfrm>
+                      <a:off x="0" y="0"/>
+                      <a:ext cx="6300470" cy="2487295"/>
+                    </a:xfrm>
+                    <a:prstGeom prst="rect">
+                      <a:avLst/>
+                    </a:prstGeom>
+                  </pic:spPr>
+                </pic:pic>
+              </a:graphicData>
+            </a:graphic>
+          </wp:inline>
+        </w:drawing>
+      </w:r>
+    </w:p>
+    <w:p>
+      <w:pPr>
+        <w:pStyle w:val="a"/>
+      </w:pPr>
+      <w:r>
+        <w:t>Получение исходного пароля после инжектирования</w:t>
+      </w:r>
+    </w:p>
+    <w:p/>
+    <w:p>
+      <w:r>
+        <w:t>При дальнейшей отладке программа завершилась с успешным выводом ключа.</w:t>
+      </w:r>
+    </w:p>
+    <w:p>
+      <w:pPr>
+        <w:pStyle w:val="a8"/>
+      </w:pPr>
+      <w:r>
+        <w:lastRenderedPageBreak/>
+        <w:drawing>
+          <wp:inline distT="0" distB="0" distL="0" distR="0" wp14:anchorId="7CF3C5EC" wp14:editId="6C51C071">
+            <wp:extent cx="6300470" cy="3620135"/>
+            <wp:effectExtent l="0" t="0" r="0" b="0"/>
+            <wp:docPr id="1004030656" name="Picture 1"/>
+            <wp:cNvGraphicFramePr>
+              <a:graphicFrameLocks xmlns:a="http://schemas.openxmlformats.org/drawingml/2006/main" noChangeAspect="1"/>
+            </wp:cNvGraphicFramePr>
+            <a:graphic xmlns:a="http://schemas.openxmlformats.org/drawingml/2006/main">
+              <a:graphicData uri="http://schemas.openxmlformats.org/drawingml/2006/picture">
+                <pic:pic xmlns:pic="http://schemas.openxmlformats.org/drawingml/2006/picture">
+                  <pic:nvPicPr>
+                    <pic:cNvPr id="1004030656" name=""/>
+                    <pic:cNvPicPr/>
+                  </pic:nvPicPr>
+                  <pic:blipFill>
+                    <a:blip r:embed="rId33"/>
+                    <a:stretch>
+                      <a:fillRect/>
+                    </a:stretch>
+                  </pic:blipFill>
+                  <pic:spPr>
+                    <a:xfrm>
+                      <a:off x="0" y="0"/>
+                      <a:ext cx="6300470" cy="3620135"/>
+                    </a:xfrm>
+                    <a:prstGeom prst="rect">
+                      <a:avLst/>
+                    </a:prstGeom>
+                  </pic:spPr>
+                </pic:pic>
+              </a:graphicData>
+            </a:graphic>
+          </wp:inline>
+        </w:drawing>
+      </w:r>
+    </w:p>
+    <w:p>
+      <w:pPr>
+        <w:pStyle w:val="a"/>
+        <w:rPr>
+          <w:lang w:val="en-US"/>
+        </w:rPr>
+      </w:pPr>
+      <w:r>
+        <w:t xml:space="preserve">Успешный дебаг программы с </w:t>
+      </w:r>
+      <w:r>
+        <w:rPr>
+          <w:lang w:val="en-US"/>
+        </w:rPr>
+        <w:t>ponce</w:t>
+      </w:r>
+      <w:r>
+        <w:t>.</w:t>
+      </w:r>
+    </w:p>
+    <w:p>
+      <w:pPr>
+        <w:rPr>
+          <w:lang w:val="en-US"/>
+        </w:rPr>
+      </w:pPr>
+    </w:p>
+    <w:p>
+      <w:r>
+        <w:t>Для анализа 2-й программы были запущены ранее написанные скрипты, которые выдали данный результат:</w:t>
+      </w:r>
+    </w:p>
+    <w:p>
+      <w:pPr>
+        <w:pStyle w:val="a8"/>
+        <w:rPr>
+          <w:lang w:val="en-US"/>
+        </w:rPr>
+      </w:pPr>
+      <w:r>
+        <w:rPr>
+          <w:lang w:val="en-US"/>
+        </w:rPr>
+        <w:lastRenderedPageBreak/>
+        <w:drawing>
+          <wp:inline distT="0" distB="0" distL="0" distR="0" wp14:anchorId="3150D17F" wp14:editId="0481D101">
+            <wp:extent cx="5572903" cy="7649643"/>
+            <wp:effectExtent l="0" t="0" r="8890" b="8890"/>
+            <wp:docPr id="875402623" name="Picture 1"/>
+            <wp:cNvGraphicFramePr>
+              <a:graphicFrameLocks xmlns:a="http://schemas.openxmlformats.org/drawingml/2006/main" noChangeAspect="1"/>
+            </wp:cNvGraphicFramePr>
+            <a:graphic xmlns:a="http://schemas.openxmlformats.org/drawingml/2006/main">
+              <a:graphicData uri="http://schemas.openxmlformats.org/drawingml/2006/picture">
+                <pic:pic xmlns:pic="http://schemas.openxmlformats.org/drawingml/2006/picture">
+                  <pic:nvPicPr>
+                    <pic:cNvPr id="875402623" name=""/>
+                    <pic:cNvPicPr/>
+                  </pic:nvPicPr>
+                  <pic:blipFill>
+                    <a:blip r:embed="rId34"/>
+                    <a:stretch>
+                      <a:fillRect/>
+                    </a:stretch>
+                  </pic:blipFill>
+                  <pic:spPr>
+                    <a:xfrm>
+                      <a:off x="0" y="0"/>
+                      <a:ext cx="5572903" cy="7649643"/>
+                    </a:xfrm>
+                    <a:prstGeom prst="rect">
+                      <a:avLst/>
+                    </a:prstGeom>
+                  </pic:spPr>
+                </pic:pic>
+              </a:graphicData>
+            </a:graphic>
+          </wp:inline>
+        </w:drawing>
+      </w:r>
+    </w:p>
+    <w:p>
+      <w:pPr>
+        <w:pStyle w:val="a"/>
+        <w:rPr>
+          <w:lang w:val="en-US"/>
+        </w:rPr>
+      </w:pPr>
+      <w:r>
+        <w:t xml:space="preserve">Результат анализа </w:t>
+      </w:r>
+      <w:r>
+        <w:rPr>
+          <w:lang w:val="en-US"/>
+        </w:rPr>
+        <w:t>crackme9.e_xe</w:t>
+      </w:r>
+    </w:p>
+    <w:p/>
+    <w:p>
+      <w:pPr>
+        <w:rPr>
+          <w:lang w:val="en-US"/>
+        </w:rPr>
+      </w:pPr>
+      <w:r>
+        <w:t xml:space="preserve">Также можно заметить, что для запуска программа требует права администратора, что усложняет ее отладку, для решения необходимо изменить в </w:t>
+      </w:r>
+      <w:r>
+        <w:lastRenderedPageBreak/>
+        <w:t xml:space="preserve">манифесте поле с требуемым уровнем прав с </w:t>
+      </w:r>
+      <w:proofErr w:type="spellStart"/>
+      <w:r>
+        <w:rPr>
+          <w:lang w:val="en-US"/>
+        </w:rPr>
+        <w:t>requireAdministrator</w:t>
+      </w:r>
+      <w:proofErr w:type="spellEnd"/>
+      <w:r>
+        <w:t xml:space="preserve"> </w:t>
+      </w:r>
+      <w:r>
+        <w:t xml:space="preserve">на </w:t>
+      </w:r>
+      <w:proofErr w:type="spellStart"/>
+      <w:r>
+        <w:rPr>
+          <w:lang w:val="en-US"/>
+        </w:rPr>
+        <w:t>asInvoker</w:t>
+      </w:r>
+      <w:proofErr w:type="spellEnd"/>
+      <w:r>
+        <w:t xml:space="preserve">, что было сделано в </w:t>
+      </w:r>
+      <w:r>
+        <w:rPr>
+          <w:lang w:val="en-US"/>
+        </w:rPr>
+        <w:t>Resource</w:t>
+      </w:r>
+      <w:r>
+        <w:t xml:space="preserve"> </w:t>
+      </w:r>
+      <w:r>
+        <w:rPr>
+          <w:lang w:val="en-US"/>
+        </w:rPr>
+        <w:t>Hacker</w:t>
+      </w:r>
+      <w:r>
+        <w:t>.</w:t>
+      </w:r>
+    </w:p>
+    <w:p>
+      <w:pPr>
+        <w:rPr>
+          <w:lang w:val="en-US"/>
+        </w:rPr>
+      </w:pPr>
+    </w:p>
+    <w:p>
+      <w:pPr>
+        <w:pStyle w:val="a8"/>
+        <w:rPr>
+          <w:lang w:val="en-US"/>
+        </w:rPr>
+      </w:pPr>
+      <w:r>
+        <w:rPr>
+          <w:lang w:val="en-US"/>
+        </w:rPr>
+        <w:drawing>
+          <wp:inline distT="0" distB="0" distL="0" distR="0" wp14:anchorId="347631AB" wp14:editId="460F09B1">
+            <wp:extent cx="6300470" cy="3410585"/>
+            <wp:effectExtent l="0" t="0" r="0" b="0"/>
+            <wp:docPr id="1840862544" name="Picture 1"/>
+            <wp:cNvGraphicFramePr>
+              <a:graphicFrameLocks xmlns:a="http://schemas.openxmlformats.org/drawingml/2006/main" noChangeAspect="1"/>
+            </wp:cNvGraphicFramePr>
+            <a:graphic xmlns:a="http://schemas.openxmlformats.org/drawingml/2006/main">
+              <a:graphicData uri="http://schemas.openxmlformats.org/drawingml/2006/picture">
+                <pic:pic xmlns:pic="http://schemas.openxmlformats.org/drawingml/2006/picture">
+                  <pic:nvPicPr>
+                    <pic:cNvPr id="1840862544" name=""/>
+                    <pic:cNvPicPr/>
+                  </pic:nvPicPr>
+                  <pic:blipFill>
+                    <a:blip r:embed="rId35"/>
+                    <a:stretch>
+                      <a:fillRect/>
+                    </a:stretch>
+                  </pic:blipFill>
+                  <pic:spPr>
+                    <a:xfrm>
+                      <a:off x="0" y="0"/>
+                      <a:ext cx="6300470" cy="3410585"/>
+                    </a:xfrm>
+                    <a:prstGeom prst="rect">
+                      <a:avLst/>
+                    </a:prstGeom>
+                  </pic:spPr>
+                </pic:pic>
+              </a:graphicData>
+            </a:graphic>
+          </wp:inline>
+        </w:drawing>
+      </w:r>
+    </w:p>
+    <w:p>
+      <w:pPr>
+        <w:pStyle w:val="a"/>
+      </w:pPr>
+      <w:r>
+        <w:t>Изменение требуемых прав</w:t>
+      </w:r>
+      <w:r>
+        <w:t xml:space="preserve"> </w:t>
+      </w:r>
+      <w:r>
+        <w:t>для запуска файла.</w:t>
+      </w:r>
+    </w:p>
+    <w:p/>
     <w:sectPr>
-      <w:headerReference w:type="even" r:id="rId14"/>
-      <w:headerReference w:type="default" r:id="rId15"/>
-      <w:footerReference w:type="even" r:id="rId16"/>
-      <w:footerReference w:type="default" r:id="rId17"/>
-      <w:headerReference w:type="first" r:id="rId18"/>
-      <w:footerReference w:type="first" r:id="rId19"/>
+      <w:headerReference w:type="even" r:id="rId36"/>
+      <w:headerReference w:type="default" r:id="rId37"/>
+      <w:footerReference w:type="even" r:id="rId38"/>
+      <w:footerReference w:type="default" r:id="rId39"/>
+      <w:headerReference w:type="first" r:id="rId40"/>
+      <w:footerReference w:type="first" r:id="rId41"/>
       <w:pgSz w:w="11906" w:h="16838"/>
       <w:pgMar w:top="1134" w:right="850" w:bottom="1134" w:left="1134" w:header="708" w:footer="708" w:gutter="0"/>
       <w:cols w:space="708"/>
@@ -2401,8 +4703,8 @@
   <w:abstractNum w:abstractNumId="8" w15:restartNumberingAfterBreak="0">
     <w:nsid w:val="0AD25075"/>
     <w:multiLevelType w:val="hybridMultilevel"/>
-    <w:tmpl w:val="AF02768E"/>
-    <w:lvl w:ilvl="0" w:tplc="08A280EC">
+    <w:tmpl w:val="96384718"/>
+    <w:lvl w:ilvl="0" w:tplc="DD28F4EC">
       <w:start w:val="1"/>
       <w:numFmt w:val="decimal"/>
       <w:pStyle w:val="a"/>
@@ -2411,9 +4713,6 @@
       <w:pPr>
         <w:ind w:left="720" w:hanging="360"/>
       </w:pPr>
-      <w:rPr>
-        <w:rFonts w:hint="default"/>
-      </w:rPr>
     </w:lvl>
     <w:lvl w:ilvl="1" w:tplc="04190019" w:tentative="1">
       <w:start w:val="1"/>
@@ -4292,6 +6591,12 @@
   </w:num>
   <w:num w:numId="26" w16cid:durableId="1095394114">
     <w:abstractNumId w:val="15"/>
+  </w:num>
+  <w:num w:numId="27" w16cid:durableId="145905414">
+    <w:abstractNumId w:val="8"/>
+    <w:lvlOverride w:ilvl="0">
+      <w:startOverride w:val="1"/>
+    </w:lvlOverride>
   </w:num>
   <w:numIdMacAtCleanup w:val="12"/>
 </w:numbering>
@@ -4939,6 +7244,7 @@
   <w:style w:type="character" w:default="1" w:styleId="DefaultParagraphFont">
     <w:name w:val="Default Paragraph Font"/>
     <w:uiPriority w:val="1"/>
+    <w:semiHidden/>
     <w:unhideWhenUsed/>
   </w:style>
   <w:style w:type="table" w:default="1" w:styleId="TableNormal">

</xml_diff>